<commit_message>
psicologia: simplifica atividade OBM para uma pagina
</commit_message>
<xml_diff>
--- a/Psicologia/Aulas/09.03/Intervencao e OBM - Problema 1.docx
+++ b/Psicologia/Aulas/09.03/Intervencao e OBM - Problema 1.docx
@@ -22,9 +22,10 @@
       <w:r>
         <w:rPr>
           <w:rFonts w:ascii="Arial" w:hAnsi="Arial" w:eastAsia="Arial"/>
+          <w:b w:val="0"/>
           <w:sz w:val="24"/>
         </w:rPr>
-        <w:t>Problema escolhido: 1 — Fábrica de algodão</w:t>
+        <w:t>Problema 1 — Fábrica de algodão</w:t>
       </w:r>
     </w:p>
     <w:p>
@@ -34,18 +35,20 @@
       <w:r>
         <w:rPr>
           <w:rFonts w:ascii="Arial" w:hAnsi="Arial" w:eastAsia="Arial"/>
+          <w:b w:val="0"/>
           <w:sz w:val="24"/>
         </w:rPr>
-        <w:t>1. Resultado organizacional e justificativa da escolha</w:t>
+        <w:t>Intervenção proposta</w:t>
       </w:r>
     </w:p>
     <w:p>
       <w:r>
         <w:rPr>
           <w:rFonts w:ascii="Arial" w:hAnsi="Arial" w:eastAsia="Arial"/>
+          <w:b w:val="0"/>
           <w:sz w:val="24"/>
         </w:rPr>
-        <w:t>O problema 1 foi escolhido porque apresenta comportamentos diretamente observáveis e mensuráveis: comparecimento, pontualidade e uso correto de equipamentos de proteção individual (EPIs). O resultado principal pretendido é reduzir faltas e atrasos e elevar a adesão aos procedimentos de segurança. A intervenção usa reforço positivo, sem ignorar que parte dos atrasos decorre da distância entre a fábrica e a residência dos funcionários. Portanto, a solução combina alterações no ambiente de trabalho com consequências positivas contingentes aos comportamentos desejados.</w:t>
+        <w:t>O objetivo é diminuir as faltas e os atrasos e aumentar o uso dos equipamentos de segurança. Antes de começar, a empresa deve acompanhar esses três pontos durante duas semanas para saber a situação atual e depois conseguir comparar os resultados.</w:t>
       </w:r>
     </w:p>
     <w:p>
@@ -55,63 +58,49 @@
       <w:r>
         <w:rPr>
           <w:rFonts w:ascii="Arial" w:hAnsi="Arial" w:eastAsia="Arial"/>
+          <w:b w:val="0"/>
           <w:sz w:val="24"/>
         </w:rPr>
-        <w:t>2. Pinpoints e linha de base</w:t>
-      </w:r>
-    </w:p>
-    <w:p>
-      <w:r>
-        <w:rPr>
-          <w:rFonts w:ascii="Arial" w:hAnsi="Arial" w:eastAsia="Arial"/>
-          <w:sz w:val="24"/>
-        </w:rPr>
-        <w:t>Os pinpoints são descritos como ações observáveis, evitando expressões vagas como “ser responsável” ou “ter comprometimento”.</w:t>
+        <w:t>Comportamentos observados</w:t>
       </w:r>
     </w:p>
     <w:p>
       <w:pPr>
         <w:pStyle w:val="ListBullet"/>
+        <w:spacing w:after="20"/>
       </w:pPr>
       <w:r>
         <w:rPr>
           <w:rFonts w:ascii="Arial" w:hAnsi="Arial" w:eastAsia="Arial"/>
           <w:sz w:val="24"/>
         </w:rPr>
-        <w:t>Presença: comparecer a todos os turnos programados, desconsiderando faltas justificadas conforme a política da empresa.</w:t>
+        <w:t>Comparecer nos dias de trabalho, tirando as faltas justificadas.</w:t>
       </w:r>
     </w:p>
     <w:p>
       <w:pPr>
         <w:pStyle w:val="ListBullet"/>
+        <w:spacing w:after="20"/>
       </w:pPr>
       <w:r>
         <w:rPr>
           <w:rFonts w:ascii="Arial" w:hAnsi="Arial" w:eastAsia="Arial"/>
           <w:sz w:val="24"/>
         </w:rPr>
-        <w:t>Pontualidade: registrar a entrada até cinco minutos depois do início previsto do turno.</w:t>
+        <w:t>Registrar a entrada até cinco minutos depois do início do turno.</w:t>
       </w:r>
     </w:p>
     <w:p>
       <w:pPr>
         <w:pStyle w:val="ListBullet"/>
+        <w:spacing w:after="20"/>
       </w:pPr>
       <w:r>
         <w:rPr>
           <w:rFonts w:ascii="Arial" w:hAnsi="Arial" w:eastAsia="Arial"/>
           <w:sz w:val="24"/>
         </w:rPr>
-        <w:t>Segurança: colocar os EPIs obrigatórios antes de entrar na área produtiva e mantê-los corretamente durante todo o período de exposição.</w:t>
-      </w:r>
-    </w:p>
-    <w:p>
-      <w:r>
-        <w:rPr>
-          <w:rFonts w:ascii="Arial" w:hAnsi="Arial" w:eastAsia="Arial"/>
-          <w:sz w:val="24"/>
-        </w:rPr>
-        <w:t>Antes da intervenção, a empresa registrará esses comportamentos durante duas semanas. A linha de base conterá: percentual de faltas injustificadas por turno; percentual de entradas fora da tolerância; e percentual de observações em que todos os EPIs obrigatórios estejam sendo usados corretamente. Os quase acidentes e acidentes também serão acompanhados, mas não serão a única medida de segurança, pois são eventos relativamente raros e podem demorar a refletir uma mudança comportamental.</w:t>
+        <w:t>Entrar na área de produção e permanecer nela usando todos os EPIs necessários.</w:t>
       </w:r>
     </w:p>
     <w:p>
@@ -121,45 +110,20 @@
       <w:r>
         <w:rPr>
           <w:rFonts w:ascii="Arial" w:hAnsi="Arial" w:eastAsia="Arial"/>
+          <w:b w:val="0"/>
           <w:sz w:val="24"/>
         </w:rPr>
-        <w:t>3. Análise funcional pelo modelo ABC</w:t>
+        <w:t>Economia de tokens</w:t>
       </w:r>
     </w:p>
     <w:p>
       <w:r>
         <w:rPr>
           <w:rFonts w:ascii="Arial" w:hAnsi="Arial" w:eastAsia="Arial"/>
+          <w:b w:val="0"/>
           <w:sz w:val="24"/>
         </w:rPr>
-        <w:t>Antecedentes (A): horários fixos; distância elevada entre residência e fábrica; transporte possivelmente irregular; cartazes e treinamentos de segurança; disponibilidade e estado dos EPIs; comunicação do supervisor no começo do turno.</w:t>
-      </w:r>
-    </w:p>
-    <w:p>
-      <w:r>
-        <w:rPr>
-          <w:rFonts w:ascii="Arial" w:hAnsi="Arial" w:eastAsia="Arial"/>
-          <w:sz w:val="24"/>
-        </w:rPr>
-        <w:t>Comportamentos (B): faltar; chegar depois do horário; entrar na área produtiva sem todos os EPIs; ou, no sentido desejado, comparecer, registrar a entrada no prazo e utilizar corretamente os equipamentos.</w:t>
-      </w:r>
-    </w:p>
-    <w:p>
-      <w:r>
-        <w:rPr>
-          <w:rFonts w:ascii="Arial" w:hAnsi="Arial" w:eastAsia="Arial"/>
-          <w:sz w:val="24"/>
-        </w:rPr>
-        <w:t>Consequências atuais (C): o comportamento seguro ou pontual recebe pouco reconhecimento imediato, enquanto a correção costuma ocorrer apenas quando há atraso, fiscalização ou risco de acidente. A consequência negativa é mais visível que o reforço do comportamento correto. Além disso, se atrasos causados pelo transporte forem tratados apenas como falha individual, a empresa poderá punir algo que o funcionário não controla.</w:t>
-      </w:r>
-    </w:p>
-    <w:p>
-      <w:r>
-        <w:rPr>
-          <w:rFonts w:ascii="Arial" w:hAnsi="Arial" w:eastAsia="Arial"/>
-          <w:sz w:val="24"/>
-        </w:rPr>
-        <w:t>O diagnóstico é que regras e treinamentos funcionam como antecedentes, mas não garantem a manutenção do comportamento. Será necessário tornar as consequências do comportamento correto mais imediatas, frequentes e relevantes, além de remover barreiras ambientais.</w:t>
+        <w:t>A empresa criará um sistema simples de pontos: 1 ponto por presença, 1 por pontualidade e 2 quando o funcionário estiver usando os EPIs corretamente durante uma verificação. Toda sexta-feira, os pontos poderão ser trocados por recompensas, como vale-alimentação, escolha preferencial de uma folga futura, cursos ou reconhecimento da empresa. Faltas justificadas não tiram pontos, e os pontos já recebidos não serão retirados como punição.</w:t>
       </w:r>
     </w:p>
     <w:p>
@@ -169,57 +133,40 @@
       <w:r>
         <w:rPr>
           <w:rFonts w:ascii="Arial" w:hAnsi="Arial" w:eastAsia="Arial"/>
+          <w:b w:val="0"/>
           <w:sz w:val="24"/>
         </w:rPr>
-        <w:t>4. Alterações nos antecedentes</w:t>
+        <w:t>Feedback e reforçamento</w:t>
       </w:r>
     </w:p>
     <w:p>
-      <w:pPr>
-        <w:pStyle w:val="ListBullet"/>
-      </w:pPr>
       <w:r>
         <w:rPr>
           <w:rFonts w:ascii="Arial" w:hAnsi="Arial" w:eastAsia="Arial"/>
+          <w:b w:val="0"/>
           <w:sz w:val="24"/>
         </w:rPr>
-        <w:t>Mapear os locais de residência e os principais motivos de atraso; ajustar o fretado, as rotas ou o início de determinados turnos quando a análise mostrar um problema coletivo de transporte.</w:t>
+        <w:t>No começo, será usada a razão fixa: sempre que o comportamento correto for observado, o funcionário recebe os pontos. Depois, pode ser usada a razão variável, em que o reforço acontece depois de uma quantidade não previsível de comportamentos corretos. Isso ajuda o comportamento a continuar mesmo sem recompensa em todas as vezes.</w:t>
       </w:r>
     </w:p>
     <w:p>
-      <w:pPr>
-        <w:pStyle w:val="ListBullet"/>
-      </w:pPr>
       <w:r>
         <w:rPr>
           <w:rFonts w:ascii="Arial" w:hAnsi="Arial" w:eastAsia="Arial"/>
+          <w:b w:val="0"/>
           <w:sz w:val="24"/>
         </w:rPr>
-        <w:t>Garantir EPIs em quantidade adequada, nos tamanhos corretos e em bom estado, com reposição simples e imediata.</w:t>
+        <w:t>Também haverá intervalo fixo, com uma avaliação toda sexta-feira para reconhecer quem manteve presença e pontualidade durante a semana. Para a segurança, será usado intervalo variável: o supervisor fará verificações em horários aleatórios e dará os pontos e um feedback imediato quando encontrar o uso correto dos EPIs.</w:t>
       </w:r>
     </w:p>
     <w:p>
-      <w:pPr>
-        <w:pStyle w:val="ListBullet"/>
-      </w:pPr>
       <w:r>
         <w:rPr>
           <w:rFonts w:ascii="Arial" w:hAnsi="Arial" w:eastAsia="Arial"/>
+          <w:b w:val="0"/>
           <w:sz w:val="24"/>
         </w:rPr>
-        <w:t>Instalar, na entrada da área produtiva, um checklist visual curto com os EPIs exigidos para cada função.</w:t>
-      </w:r>
-    </w:p>
-    <w:p>
-      <w:pPr>
-        <w:pStyle w:val="ListBullet"/>
-      </w:pPr>
-      <w:r>
-        <w:rPr>
-          <w:rFonts w:ascii="Arial" w:hAnsi="Arial" w:eastAsia="Arial"/>
-          <w:sz w:val="24"/>
-        </w:rPr>
-        <w:t>Realizar uma checagem de segurança de dois minutos no começo de cada turno e permitir que qualquer funcionário solicite substituição de equipamento sem punição.</w:t>
+        <w:t>O feedback deve ser direto e explicar o comportamento, por exemplo: “Você colocou todos os equipamentos antes de entrar na produção, então está seguindo o padrão de segurança”. Quando houver erro, a correção será feita em particular, mostrando o que precisa mudar.</w:t>
       </w:r>
     </w:p>
     <w:p>
@@ -229,287 +176,25 @@
       <w:r>
         <w:rPr>
           <w:rFonts w:ascii="Arial" w:hAnsi="Arial" w:eastAsia="Arial"/>
+          <w:b w:val="0"/>
           <w:sz w:val="24"/>
         </w:rPr>
-        <w:t>5. Economia de tokens</w:t>
+        <w:t>Avaliação</w:t>
       </w:r>
     </w:p>
     <w:p>
       <w:r>
         <w:rPr>
           <w:rFonts w:ascii="Arial" w:hAnsi="Arial" w:eastAsia="Arial"/>
+          <w:b w:val="0"/>
           <w:sz w:val="24"/>
         </w:rPr>
-        <w:t>Será criado um sistema de pontos digitais denominado “Pontos de Presença e Segurança”. Os pontos funcionarão como tokens: terão valor porque poderão ser trocados posteriormente por reforçadores escolhidos pelos próprios funcionários.</w:t>
-      </w:r>
-    </w:p>
-    <w:p>
-      <w:pPr>
-        <w:pStyle w:val="ListBullet"/>
-      </w:pPr>
-      <w:r>
-        <w:rPr>
-          <w:rFonts w:ascii="Arial" w:hAnsi="Arial" w:eastAsia="Arial"/>
-          <w:sz w:val="24"/>
-        </w:rPr>
-        <w:t>1 ponto por comparecimento ao turno programado, exceto quando houver falta justificada.</w:t>
-      </w:r>
-    </w:p>
-    <w:p>
-      <w:pPr>
-        <w:pStyle w:val="ListBullet"/>
-      </w:pPr>
-      <w:r>
-        <w:rPr>
-          <w:rFonts w:ascii="Arial" w:hAnsi="Arial" w:eastAsia="Arial"/>
-          <w:sz w:val="24"/>
-        </w:rPr>
-        <w:t>2 pontos por registro de entrada dentro da tolerância definida.</w:t>
-      </w:r>
-    </w:p>
-    <w:p>
-      <w:pPr>
-        <w:pStyle w:val="ListBullet"/>
-      </w:pPr>
-      <w:r>
-        <w:rPr>
-          <w:rFonts w:ascii="Arial" w:hAnsi="Arial" w:eastAsia="Arial"/>
-          <w:sz w:val="24"/>
-        </w:rPr>
-        <w:t>2 pontos quando uma observação de segurança encontrar todos os EPIs utilizados corretamente.</w:t>
-      </w:r>
-    </w:p>
-    <w:p>
-      <w:pPr>
-        <w:pStyle w:val="ListBullet"/>
-      </w:pPr>
-      <w:r>
-        <w:rPr>
-          <w:rFonts w:ascii="Arial" w:hAnsi="Arial" w:eastAsia="Arial"/>
-          <w:sz w:val="24"/>
-        </w:rPr>
-        <w:t>Bônus coletivo de 3 pontos para cada integrante quando a equipe atingir, na semana, pelo menos 95% de conformidade com os EPIs e não ocultar incidentes ou quase acidentes.</w:t>
-      </w:r>
-    </w:p>
-    <w:p>
-      <w:r>
-        <w:rPr>
-          <w:rFonts w:ascii="Arial" w:hAnsi="Arial" w:eastAsia="Arial"/>
-          <w:sz w:val="24"/>
-        </w:rPr>
-        <w:t>A combinação de pontos individuais e coletivos evita que o programa estimule competição excessiva. O bônus de segurança depende da conformidade observada e da comunicação transparente; assim, ninguém ganha ao esconder um incidente.</w:t>
-      </w:r>
-    </w:p>
-    <w:p>
-      <w:r>
-        <w:rPr>
-          <w:rFonts w:ascii="Arial" w:hAnsi="Arial" w:eastAsia="Arial"/>
-          <w:sz w:val="24"/>
-        </w:rPr>
-        <w:t>A empresa oferecerá um catálogo de trocas para respeitar preferências individuais: participação em curso pago pela empresa; prioridade para escolher uma data de folga programada, sem comprometer a operação; vale-alimentação adicional; reconhecimento formal enviado de modo privado; ou doação equivalente para uma instituição escolhida pelo funcionário. Os pontos serão adicionais ao salário e aos direitos existentes.</w:t>
-      </w:r>
-    </w:p>
-    <w:p>
-      <w:pPr>
-        <w:pStyle w:val="Heading1"/>
-      </w:pPr>
-      <w:r>
-        <w:rPr>
-          <w:rFonts w:ascii="Arial" w:hAnsi="Arial" w:eastAsia="Arial"/>
-          <w:sz w:val="24"/>
-        </w:rPr>
-        <w:t>6. Esquemas de reforçamento</w:t>
-      </w:r>
-    </w:p>
-    <w:p>
-      <w:r>
-        <w:rPr>
-          <w:rFonts w:ascii="Arial" w:hAnsi="Arial" w:eastAsia="Arial"/>
-          <w:sz w:val="24"/>
-        </w:rPr>
-        <w:t>Fase de aquisição — razão fixa: nas duas primeiras semanas de intervenção, será usado um esquema de razão fixa 1 (RF1). Cada ocorrência elegível de pontualidade e cada observação de uso correto de EPIs produzirá imediatamente os pontos previstos. A relação simples ajuda o funcionário a identificar qual comportamento gera a consequência.</w:t>
-      </w:r>
-    </w:p>
-    <w:p>
-      <w:r>
-        <w:rPr>
-          <w:rFonts w:ascii="Arial" w:hAnsi="Arial" w:eastAsia="Arial"/>
-          <w:sz w:val="24"/>
-        </w:rPr>
-        <w:t>Fase de manutenção — razão variável: a partir da terceira semana, as observações de segurança continuarão ocorrendo sem que o trabalhador saiba quantas respostas adequadas serão necessárias para uma nova oportunidade de token. O número de ocorrências entre os reforços variará em torno de uma média previamente definida. A variabilidade tende a aumentar a persistência do comportamento, mas as inspeções formais de segurança continuarão existindo independentemente da recompensa.</w:t>
-      </w:r>
-    </w:p>
-    <w:p>
-      <w:r>
-        <w:rPr>
-          <w:rFonts w:ascii="Arial" w:hAnsi="Arial" w:eastAsia="Arial"/>
-          <w:sz w:val="24"/>
-        </w:rPr>
-        <w:t>Intervalo fixo: toda sexta-feira, os funcionários que mantiverem presença e pontualidade ao longo da semana poderão receber um bônus. O reforço estará disponível após um período conhecido e dependerá da manutenção do comportamento no intervalo.</w:t>
-      </w:r>
-    </w:p>
-    <w:p>
-      <w:r>
-        <w:rPr>
-          <w:rFonts w:ascii="Arial" w:hAnsi="Arial" w:eastAsia="Arial"/>
-          <w:sz w:val="24"/>
-        </w:rPr>
-        <w:t>Intervalo variável: o supervisor fará observações de segurança em momentos imprevisíveis. Quando encontrar o comportamento correto, fornecerá feedback imediato e poderá conceder tokens. O objetivo é manter a utilização dos EPIs durante todo o turno, e não somente perto de uma inspeção com horário marcado.</w:t>
-      </w:r>
-    </w:p>
-    <w:p>
-      <w:pPr>
-        <w:pStyle w:val="Heading1"/>
-      </w:pPr>
-      <w:r>
-        <w:rPr>
-          <w:rFonts w:ascii="Arial" w:hAnsi="Arial" w:eastAsia="Arial"/>
-          <w:sz w:val="24"/>
-        </w:rPr>
-        <w:t>7. Feedback</w:t>
-      </w:r>
-    </w:p>
-    <w:p>
-      <w:r>
-        <w:rPr>
-          <w:rFonts w:ascii="Arial" w:hAnsi="Arial" w:eastAsia="Arial"/>
-          <w:sz w:val="24"/>
-        </w:rPr>
-        <w:t>O feedback será específico, individualizado, merecido e próximo do comportamento. Em vez de dizer apenas “bom trabalho”, o supervisor deverá indicar a ação e sua consequência, por exemplo: “Você colocou os óculos e o protetor antes de entrar na área; isso reduz a exposição e mantém o padrão de segurança do turno”. Quando ocorrer um erro, a correção será privada e instrutiva: o supervisor apontará o comportamento observado, demonstrará a forma correta e pedirá nova execução. Não haverá humilhação pública nem retirada de tokens já ganhos.</w:t>
-      </w:r>
-    </w:p>
-    <w:p>
-      <w:r>
-        <w:rPr>
-          <w:rFonts w:ascii="Arial" w:hAnsi="Arial" w:eastAsia="Arial"/>
-          <w:sz w:val="24"/>
-        </w:rPr>
-        <w:t>Cada funcionário receberá semanalmente um resumo simples de presença, pontualidade, conformidade com EPIs e pontos acumulados. A equipe verá somente os resultados agregados, sem ranking nominal. A cada duas semanas, os empregados poderão informar se os reforçadores continuam relevantes e se existem obstáculos ambientais ainda não solucionados.</w:t>
-      </w:r>
-    </w:p>
-    <w:p>
-      <w:pPr>
-        <w:pStyle w:val="Heading1"/>
-      </w:pPr>
-      <w:r>
-        <w:rPr>
-          <w:rFonts w:ascii="Arial" w:hAnsi="Arial" w:eastAsia="Arial"/>
-          <w:sz w:val="24"/>
-        </w:rPr>
-        <w:t>8. Implementação e avaliação</w:t>
-      </w:r>
-    </w:p>
-    <w:p>
-      <w:pPr>
-        <w:pStyle w:val="ListBullet"/>
-      </w:pPr>
-      <w:r>
-        <w:rPr>
-          <w:rFonts w:ascii="Arial" w:hAnsi="Arial" w:eastAsia="Arial"/>
-          <w:sz w:val="24"/>
-        </w:rPr>
-        <w:t>Semanas 1 e 2: registro da linha de base e escuta dos funcionários sobre transporte, equipamentos e reforçadores preferidos.</w:t>
-      </w:r>
-    </w:p>
-    <w:p>
-      <w:pPr>
-        <w:pStyle w:val="ListBullet"/>
-      </w:pPr>
-      <w:r>
-        <w:rPr>
-          <w:rFonts w:ascii="Arial" w:hAnsi="Arial" w:eastAsia="Arial"/>
-          <w:sz w:val="24"/>
-        </w:rPr>
-        <w:t>Semanas 3 e 4: início da economia de tokens com RF1, feedback imediato e correção das barreiras prioritárias.</w:t>
-      </w:r>
-    </w:p>
-    <w:p>
-      <w:pPr>
-        <w:pStyle w:val="ListBullet"/>
-      </w:pPr>
-      <w:r>
-        <w:rPr>
-          <w:rFonts w:ascii="Arial" w:hAnsi="Arial" w:eastAsia="Arial"/>
-          <w:sz w:val="24"/>
-        </w:rPr>
-        <w:t>Semanas 5 a 8: introdução gradual dos esquemas variáveis e manutenção do bônus semanal por intervalo fixo.</w:t>
-      </w:r>
-    </w:p>
-    <w:p>
-      <w:pPr>
-        <w:pStyle w:val="ListBullet"/>
-      </w:pPr>
-      <w:r>
-        <w:rPr>
-          <w:rFonts w:ascii="Arial" w:hAnsi="Arial" w:eastAsia="Arial"/>
-          <w:sz w:val="24"/>
-        </w:rPr>
-        <w:t>Final da semana 8: comparação com a linha de base e decisão de manter, ajustar ou encerrar componentes do programa.</w:t>
-      </w:r>
-    </w:p>
-    <w:p>
-      <w:r>
-        <w:rPr>
-          <w:rFonts w:ascii="Arial" w:hAnsi="Arial" w:eastAsia="Arial"/>
-          <w:sz w:val="24"/>
-        </w:rPr>
-        <w:t>Os critérios iniciais de sucesso serão: redução de pelo menos 30% nas faltas injustificadas; redução de pelo menos 30% nos atrasos; e mínimo de 95% de conformidade com o uso correto dos EPIs nas observações. Também serão analisados quase acidentes, relatos de obstáculos e percepção de justiça do programa. Se a pontualidade não melhorar, mas os dados mostrarem atrasos concentrados em uma rota, a prioridade será corrigir o transporte, não aumentar a recompensa.</w:t>
-      </w:r>
-    </w:p>
-    <w:p>
-      <w:pPr>
-        <w:pStyle w:val="Heading1"/>
-      </w:pPr>
-      <w:r>
-        <w:rPr>
-          <w:rFonts w:ascii="Arial" w:hAnsi="Arial" w:eastAsia="Arial"/>
-          <w:sz w:val="24"/>
-        </w:rPr>
-        <w:t>9. Cuidados éticos e manutenção</w:t>
-      </w:r>
-    </w:p>
-    <w:p>
-      <w:r>
-        <w:rPr>
-          <w:rFonts w:ascii="Arial" w:hAnsi="Arial" w:eastAsia="Arial"/>
-          <w:sz w:val="24"/>
-        </w:rPr>
-        <w:t>O sistema não deverá punir doenças, emergências familiares ou limitações fora do controle do funcionário. Os critérios precisam ser divulgados antes do início e aplicados de forma igual. Não haverá perda de salário, exposição de resultados individuais ou retirada de pontos como punição. A participação dos trabalhadores na escolha das recompensas reduz o risco de reforçadores irrelevantes.</w:t>
-      </w:r>
-    </w:p>
-    <w:p>
-      <w:r>
-        <w:rPr>
-          <w:rFonts w:ascii="Arial" w:hAnsi="Arial" w:eastAsia="Arial"/>
-          <w:sz w:val="24"/>
-        </w:rPr>
-        <w:t>Depois de oito semanas, os tokens serão reduzidos gradualmente, enquanto permanecerão o feedback dos supervisores, as melhorias de transporte, a disponibilidade de EPIs e o reconhecimento social. Essa retirada gradual diminui a possibilidade de o comportamento desaparecer quando a economia de fichas terminar.</w:t>
-      </w:r>
-    </w:p>
-    <w:p>
-      <w:pPr>
-        <w:pStyle w:val="Heading1"/>
-      </w:pPr>
-      <w:r>
-        <w:rPr>
-          <w:rFonts w:ascii="Arial" w:hAnsi="Arial" w:eastAsia="Arial"/>
-          <w:sz w:val="24"/>
-        </w:rPr>
-        <w:t>Conclusão</w:t>
-      </w:r>
-    </w:p>
-    <w:p>
-      <w:r>
-        <w:rPr>
-          <w:rFonts w:ascii="Arial" w:hAnsi="Arial" w:eastAsia="Arial"/>
-          <w:sz w:val="24"/>
-        </w:rPr>
-        <w:t>A intervenção não atribui os problemas exclusivamente aos funcionários. Ela define comportamentos objetivos, mede a linha de base, altera antecedentes, aplica consequências positivas e avalia os efeitos. A economia de tokens torna o reforço mais imediato e flexível; o feedback informa exatamente qual desempenho deve continuar; e os esquemas de razão e intervalo ajudam a desenvolver e manter os comportamentos. Ao mesmo tempo, a correção de transporte e disponibilidade de EPIs trata causas organizacionais que uma recompensa isolada não resolveria.</w:t>
+        <w:t>Depois de seis semanas, a empresa comparará a quantidade de faltas, atrasos e uso correto dos EPIs com as duas semanas iniciais. Se o atraso continuar concentrado nos funcionários que moram longe, a empresa também deverá rever o transporte ou o horário, porque não adianta tratar um problema da organização apenas como falta de esforço do funcionário.</w:t>
       </w:r>
     </w:p>
     <w:sectPr>
       <w:pgSz w:w="12240" w:h="15840"/>
-      <w:pgMar w:top="1417" w:right="1417" w:bottom="1417" w:left="1417" w:header="720" w:footer="720" w:gutter="0"/>
+      <w:pgMar w:top="1134" w:right="1417" w:bottom="1134" w:left="1417" w:header="720" w:footer="720" w:gutter="0"/>
       <w:cols w:space="720"/>
       <w:docGrid w:linePitch="360"/>
     </w:sectPr>
@@ -881,7 +566,7 @@
     <w:qFormat/>
     <w:rsid w:val="00FC693F"/>
     <w:pPr>
-      <w:spacing w:after="120" w:line="276" w:lineRule="auto"/>
+      <w:spacing w:after="100" w:line="240" w:lineRule="auto"/>
     </w:pPr>
     <w:rPr>
       <w:rFonts w:ascii="Arial" w:hAnsi="Arial" w:eastAsia="Arial"/>
@@ -902,10 +587,6 @@
       </w:tabs>
       <w:spacing w:after="0" w:line="240" w:lineRule="auto"/>
     </w:pPr>
-    <w:rPr>
-      <w:rFonts w:ascii="Arial" w:hAnsi="Arial" w:eastAsia="Arial"/>
-      <w:sz w:val="24"/>
-    </w:rPr>
   </w:style>
   <w:style w:type="character" w:customStyle="1" w:styleId="HeaderChar">
     <w:name w:val="Header Char"/>
@@ -913,10 +594,6 @@
     <w:link w:val="Header"/>
     <w:uiPriority w:val="99"/>
     <w:rsid w:val="00E618BF"/>
-    <w:rPr>
-      <w:rFonts w:ascii="Arial" w:hAnsi="Arial" w:eastAsia="Arial"/>
-      <w:sz w:val="24"/>
-    </w:rPr>
   </w:style>
   <w:style w:type="paragraph" w:styleId="Footer">
     <w:name w:val="footer"/>
@@ -932,10 +609,6 @@
       </w:tabs>
       <w:spacing w:after="0" w:line="240" w:lineRule="auto"/>
     </w:pPr>
-    <w:rPr>
-      <w:rFonts w:ascii="Arial" w:hAnsi="Arial" w:eastAsia="Arial"/>
-      <w:sz w:val="24"/>
-    </w:rPr>
   </w:style>
   <w:style w:type="character" w:customStyle="1" w:styleId="FooterChar">
     <w:name w:val="Footer Char"/>
@@ -943,10 +616,6 @@
     <w:link w:val="Footer"/>
     <w:uiPriority w:val="99"/>
     <w:rsid w:val="00E618BF"/>
-    <w:rPr>
-      <w:rFonts w:ascii="Arial" w:hAnsi="Arial" w:eastAsia="Arial"/>
-      <w:sz w:val="24"/>
-    </w:rPr>
   </w:style>
   <w:style w:type="paragraph" w:styleId="Heading1">
     <w:name w:val="heading 1"/>
@@ -959,13 +628,14 @@
     <w:pPr>
       <w:keepNext/>
       <w:keepLines/>
-      <w:spacing w:before="200" w:after="80"/>
+      <w:spacing w:before="100" w:after="40"/>
       <w:outlineLvl w:val="0"/>
     </w:pPr>
     <w:rPr>
       <w:rFonts w:asciiTheme="majorHAnsi" w:eastAsiaTheme="majorEastAsia" w:hAnsiTheme="majorHAnsi" w:cstheme="majorBidi" w:ascii="Arial" w:hAnsi="Arial" w:eastAsia="Arial"/>
       <w:b/>
       <w:bCs/>
+      <w:color w:val="365F91" w:themeColor="accent1" w:themeShade="BF"/>
       <w:sz w:val="24"/>
       <w:szCs w:val="28"/>
     </w:rPr>
@@ -982,13 +652,14 @@
     <w:pPr>
       <w:keepNext/>
       <w:keepLines/>
-      <w:spacing w:before="200" w:after="80"/>
+      <w:spacing w:before="100" w:after="40"/>
       <w:outlineLvl w:val="1"/>
     </w:pPr>
     <w:rPr>
       <w:rFonts w:asciiTheme="majorHAnsi" w:eastAsiaTheme="majorEastAsia" w:hAnsiTheme="majorHAnsi" w:cstheme="majorBidi" w:ascii="Arial" w:hAnsi="Arial" w:eastAsia="Arial"/>
       <w:b/>
       <w:bCs/>
+      <w:color w:val="4F81BD" w:themeColor="accent1"/>
       <w:sz w:val="24"/>
       <w:szCs w:val="26"/>
     </w:rPr>
@@ -1009,10 +680,10 @@
       <w:outlineLvl w:val="2"/>
     </w:pPr>
     <w:rPr>
-      <w:rFonts w:asciiTheme="majorHAnsi" w:eastAsiaTheme="majorEastAsia" w:hAnsiTheme="majorHAnsi" w:cstheme="majorBidi" w:ascii="Arial" w:hAnsi="Arial" w:eastAsia="Arial"/>
+      <w:rFonts w:asciiTheme="majorHAnsi" w:eastAsiaTheme="majorEastAsia" w:hAnsiTheme="majorHAnsi" w:cstheme="majorBidi"/>
       <w:b/>
       <w:bCs/>
-      <w:sz w:val="24"/>
+      <w:color w:val="4F81BD" w:themeColor="accent1"/>
     </w:rPr>
   </w:style>
   <w:style w:type="paragraph" w:styleId="Heading4">
@@ -1032,12 +703,12 @@
       <w:outlineLvl w:val="3"/>
     </w:pPr>
     <w:rPr>
-      <w:rFonts w:asciiTheme="majorHAnsi" w:eastAsiaTheme="majorEastAsia" w:hAnsiTheme="majorHAnsi" w:cstheme="majorBidi" w:ascii="Arial" w:hAnsi="Arial" w:eastAsia="Arial"/>
+      <w:rFonts w:asciiTheme="majorHAnsi" w:eastAsiaTheme="majorEastAsia" w:hAnsiTheme="majorHAnsi" w:cstheme="majorBidi"/>
       <w:b/>
       <w:bCs/>
       <w:i/>
       <w:iCs/>
-      <w:sz w:val="24"/>
+      <w:color w:val="4F81BD" w:themeColor="accent1"/>
     </w:rPr>
   </w:style>
   <w:style w:type="paragraph" w:styleId="Heading5">
@@ -1057,8 +728,8 @@
       <w:outlineLvl w:val="4"/>
     </w:pPr>
     <w:rPr>
-      <w:rFonts w:asciiTheme="majorHAnsi" w:eastAsiaTheme="majorEastAsia" w:hAnsiTheme="majorHAnsi" w:cstheme="majorBidi" w:ascii="Arial" w:hAnsi="Arial" w:eastAsia="Arial"/>
-      <w:sz w:val="24"/>
+      <w:rFonts w:asciiTheme="majorHAnsi" w:eastAsiaTheme="majorEastAsia" w:hAnsiTheme="majorHAnsi" w:cstheme="majorBidi"/>
+      <w:color w:val="243F60" w:themeColor="accent1" w:themeShade="7F"/>
     </w:rPr>
   </w:style>
   <w:style w:type="paragraph" w:styleId="Heading6">
@@ -1078,10 +749,10 @@
       <w:outlineLvl w:val="5"/>
     </w:pPr>
     <w:rPr>
-      <w:rFonts w:asciiTheme="majorHAnsi" w:eastAsiaTheme="majorEastAsia" w:hAnsiTheme="majorHAnsi" w:cstheme="majorBidi" w:ascii="Arial" w:hAnsi="Arial" w:eastAsia="Arial"/>
+      <w:rFonts w:asciiTheme="majorHAnsi" w:eastAsiaTheme="majorEastAsia" w:hAnsiTheme="majorHAnsi" w:cstheme="majorBidi"/>
       <w:i/>
       <w:iCs/>
-      <w:sz w:val="24"/>
+      <w:color w:val="243F60" w:themeColor="accent1" w:themeShade="7F"/>
     </w:rPr>
   </w:style>
   <w:style w:type="paragraph" w:styleId="Heading7">
@@ -1101,10 +772,10 @@
       <w:outlineLvl w:val="6"/>
     </w:pPr>
     <w:rPr>
-      <w:rFonts w:asciiTheme="majorHAnsi" w:eastAsiaTheme="majorEastAsia" w:hAnsiTheme="majorHAnsi" w:cstheme="majorBidi" w:ascii="Arial" w:hAnsi="Arial" w:eastAsia="Arial"/>
+      <w:rFonts w:asciiTheme="majorHAnsi" w:eastAsiaTheme="majorEastAsia" w:hAnsiTheme="majorHAnsi" w:cstheme="majorBidi"/>
       <w:i/>
       <w:iCs/>
-      <w:sz w:val="24"/>
+      <w:color w:val="404040" w:themeColor="text1" w:themeTint="BF"/>
     </w:rPr>
   </w:style>
   <w:style w:type="paragraph" w:styleId="Heading8">
@@ -1124,8 +795,9 @@
       <w:outlineLvl w:val="7"/>
     </w:pPr>
     <w:rPr>
-      <w:rFonts w:asciiTheme="majorHAnsi" w:eastAsiaTheme="majorEastAsia" w:hAnsiTheme="majorHAnsi" w:cstheme="majorBidi" w:ascii="Arial" w:hAnsi="Arial" w:eastAsia="Arial"/>
-      <w:sz w:val="24"/>
+      <w:rFonts w:asciiTheme="majorHAnsi" w:eastAsiaTheme="majorEastAsia" w:hAnsiTheme="majorHAnsi" w:cstheme="majorBidi"/>
+      <w:color w:val="4F81BD" w:themeColor="accent1"/>
+      <w:sz w:val="20"/>
       <w:szCs w:val="20"/>
     </w:rPr>
   </w:style>
@@ -1146,10 +818,11 @@
       <w:outlineLvl w:val="8"/>
     </w:pPr>
     <w:rPr>
-      <w:rFonts w:asciiTheme="majorHAnsi" w:eastAsiaTheme="majorEastAsia" w:hAnsiTheme="majorHAnsi" w:cstheme="majorBidi" w:ascii="Arial" w:hAnsi="Arial" w:eastAsia="Arial"/>
+      <w:rFonts w:asciiTheme="majorHAnsi" w:eastAsiaTheme="majorEastAsia" w:hAnsiTheme="majorHAnsi" w:cstheme="majorBidi"/>
       <w:i/>
       <w:iCs/>
-      <w:sz w:val="24"/>
+      <w:color w:val="404040" w:themeColor="text1" w:themeTint="BF"/>
+      <w:sz w:val="20"/>
       <w:szCs w:val="20"/>
     </w:rPr>
   </w:style>
@@ -1158,20 +831,12 @@
     <w:uiPriority w:val="1"/>
     <w:semiHidden/>
     <w:unhideWhenUsed/>
-    <w:rPr>
-      <w:rFonts w:ascii="Arial" w:hAnsi="Arial" w:eastAsia="Arial"/>
-      <w:sz w:val="24"/>
-    </w:rPr>
   </w:style>
   <w:style w:type="table" w:default="1" w:styleId="TableNormal">
     <w:name w:val="Normal Table"/>
     <w:uiPriority w:val="99"/>
     <w:semiHidden/>
     <w:unhideWhenUsed/>
-    <w:rPr>
-      <w:rFonts w:ascii="Arial" w:hAnsi="Arial" w:eastAsia="Arial"/>
-      <w:sz w:val="24"/>
-    </w:rPr>
     <w:tblPr>
       <w:tblInd w:w="0" w:type="dxa"/>
       <w:tblCellMar>
@@ -1196,10 +861,6 @@
     <w:pPr>
       <w:spacing w:after="0" w:line="240" w:lineRule="auto"/>
     </w:pPr>
-    <w:rPr>
-      <w:rFonts w:ascii="Arial" w:hAnsi="Arial" w:eastAsia="Arial"/>
-      <w:sz w:val="24"/>
-    </w:rPr>
   </w:style>
   <w:style w:type="character" w:customStyle="1" w:styleId="Heading1Char">
     <w:name w:val="Heading 1 Char"/>
@@ -1208,10 +869,11 @@
     <w:uiPriority w:val="9"/>
     <w:rsid w:val="00FC693F"/>
     <w:rPr>
-      <w:rFonts w:asciiTheme="majorHAnsi" w:eastAsiaTheme="majorEastAsia" w:hAnsiTheme="majorHAnsi" w:cstheme="majorBidi" w:ascii="Arial" w:hAnsi="Arial" w:eastAsia="Arial"/>
+      <w:rFonts w:asciiTheme="majorHAnsi" w:eastAsiaTheme="majorEastAsia" w:hAnsiTheme="majorHAnsi" w:cstheme="majorBidi"/>
       <w:b/>
       <w:bCs/>
-      <w:sz w:val="24"/>
+      <w:color w:val="365F91" w:themeColor="accent1" w:themeShade="BF"/>
+      <w:sz w:val="28"/>
       <w:szCs w:val="28"/>
     </w:rPr>
   </w:style>
@@ -1222,10 +884,11 @@
     <w:uiPriority w:val="9"/>
     <w:rsid w:val="00FC693F"/>
     <w:rPr>
-      <w:rFonts w:asciiTheme="majorHAnsi" w:eastAsiaTheme="majorEastAsia" w:hAnsiTheme="majorHAnsi" w:cstheme="majorBidi" w:ascii="Arial" w:hAnsi="Arial" w:eastAsia="Arial"/>
+      <w:rFonts w:asciiTheme="majorHAnsi" w:eastAsiaTheme="majorEastAsia" w:hAnsiTheme="majorHAnsi" w:cstheme="majorBidi"/>
       <w:b/>
       <w:bCs/>
-      <w:sz w:val="24"/>
+      <w:color w:val="4F81BD" w:themeColor="accent1"/>
+      <w:sz w:val="26"/>
       <w:szCs w:val="26"/>
     </w:rPr>
   </w:style>
@@ -1236,10 +899,10 @@
     <w:uiPriority w:val="9"/>
     <w:rsid w:val="00FC693F"/>
     <w:rPr>
-      <w:rFonts w:asciiTheme="majorHAnsi" w:eastAsiaTheme="majorEastAsia" w:hAnsiTheme="majorHAnsi" w:cstheme="majorBidi" w:ascii="Arial" w:hAnsi="Arial" w:eastAsia="Arial"/>
+      <w:rFonts w:asciiTheme="majorHAnsi" w:eastAsiaTheme="majorEastAsia" w:hAnsiTheme="majorHAnsi" w:cstheme="majorBidi"/>
       <w:b/>
       <w:bCs/>
-      <w:sz w:val="24"/>
+      <w:color w:val="4F81BD" w:themeColor="accent1"/>
     </w:rPr>
   </w:style>
   <w:style w:type="paragraph" w:styleId="Title">
@@ -1258,10 +921,11 @@
       <w:contextualSpacing/>
     </w:pPr>
     <w:rPr>
-      <w:rFonts w:asciiTheme="majorHAnsi" w:eastAsiaTheme="majorEastAsia" w:hAnsiTheme="majorHAnsi" w:cstheme="majorBidi" w:ascii="Arial" w:hAnsi="Arial" w:eastAsia="Arial"/>
+      <w:rFonts w:asciiTheme="majorHAnsi" w:eastAsiaTheme="majorEastAsia" w:hAnsiTheme="majorHAnsi" w:cstheme="majorBidi"/>
+      <w:color w:val="17365D" w:themeColor="text2" w:themeShade="BF"/>
       <w:spacing w:val="5"/>
       <w:kern w:val="28"/>
-      <w:sz w:val="24"/>
+      <w:sz w:val="52"/>
       <w:szCs w:val="52"/>
     </w:rPr>
   </w:style>
@@ -1272,10 +936,11 @@
     <w:uiPriority w:val="10"/>
     <w:rsid w:val="00FC693F"/>
     <w:rPr>
-      <w:rFonts w:asciiTheme="majorHAnsi" w:eastAsiaTheme="majorEastAsia" w:hAnsiTheme="majorHAnsi" w:cstheme="majorBidi" w:ascii="Arial" w:hAnsi="Arial" w:eastAsia="Arial"/>
+      <w:rFonts w:asciiTheme="majorHAnsi" w:eastAsiaTheme="majorEastAsia" w:hAnsiTheme="majorHAnsi" w:cstheme="majorBidi"/>
+      <w:color w:val="17365D" w:themeColor="text2" w:themeShade="BF"/>
       <w:spacing w:val="5"/>
       <w:kern w:val="28"/>
-      <w:sz w:val="24"/>
+      <w:sz w:val="52"/>
       <w:szCs w:val="52"/>
     </w:rPr>
   </w:style>
@@ -1293,9 +958,10 @@
       </w:numPr>
     </w:pPr>
     <w:rPr>
-      <w:rFonts w:asciiTheme="majorHAnsi" w:eastAsiaTheme="majorEastAsia" w:hAnsiTheme="majorHAnsi" w:cstheme="majorBidi" w:ascii="Arial" w:hAnsi="Arial" w:eastAsia="Arial"/>
+      <w:rFonts w:asciiTheme="majorHAnsi" w:eastAsiaTheme="majorEastAsia" w:hAnsiTheme="majorHAnsi" w:cstheme="majorBidi"/>
       <w:i/>
       <w:iCs/>
+      <w:color w:val="4F81BD" w:themeColor="accent1"/>
       <w:spacing w:val="15"/>
       <w:sz w:val="24"/>
       <w:szCs w:val="24"/>
@@ -1308,9 +974,10 @@
     <w:uiPriority w:val="11"/>
     <w:rsid w:val="00FC693F"/>
     <w:rPr>
-      <w:rFonts w:asciiTheme="majorHAnsi" w:eastAsiaTheme="majorEastAsia" w:hAnsiTheme="majorHAnsi" w:cstheme="majorBidi" w:ascii="Arial" w:hAnsi="Arial" w:eastAsia="Arial"/>
+      <w:rFonts w:asciiTheme="majorHAnsi" w:eastAsiaTheme="majorEastAsia" w:hAnsiTheme="majorHAnsi" w:cstheme="majorBidi"/>
       <w:i/>
       <w:iCs/>
+      <w:color w:val="4F81BD" w:themeColor="accent1"/>
       <w:spacing w:val="15"/>
       <w:sz w:val="24"/>
       <w:szCs w:val="24"/>
@@ -1326,10 +993,6 @@
       <w:ind w:left="720"/>
       <w:contextualSpacing/>
     </w:pPr>
-    <w:rPr>
-      <w:rFonts w:ascii="Arial" w:hAnsi="Arial" w:eastAsia="Arial"/>
-      <w:sz w:val="24"/>
-    </w:rPr>
   </w:style>
   <w:style w:type="paragraph" w:styleId="BodyText">
     <w:name w:val="Body Text"/>
@@ -1341,10 +1004,6 @@
     <w:pPr>
       <w:spacing w:after="120"/>
     </w:pPr>
-    <w:rPr>
-      <w:rFonts w:ascii="Arial" w:hAnsi="Arial" w:eastAsia="Arial"/>
-      <w:sz w:val="24"/>
-    </w:rPr>
   </w:style>
   <w:style w:type="character" w:customStyle="1" w:styleId="BodyTextChar">
     <w:name w:val="Body Text Char"/>
@@ -1352,10 +1011,6 @@
     <w:link w:val="BodyText"/>
     <w:uiPriority w:val="99"/>
     <w:rsid w:val="00AA1D8D"/>
-    <w:rPr>
-      <w:rFonts w:ascii="Arial" w:hAnsi="Arial" w:eastAsia="Arial"/>
-      <w:sz w:val="24"/>
-    </w:rPr>
   </w:style>
   <w:style w:type="paragraph" w:styleId="BodyText2">
     <w:name w:val="Body Text 2"/>
@@ -1367,10 +1022,6 @@
     <w:pPr>
       <w:spacing w:after="120" w:line="480" w:lineRule="auto"/>
     </w:pPr>
-    <w:rPr>
-      <w:rFonts w:ascii="Arial" w:hAnsi="Arial" w:eastAsia="Arial"/>
-      <w:sz w:val="24"/>
-    </w:rPr>
   </w:style>
   <w:style w:type="character" w:customStyle="1" w:styleId="BodyText2Char">
     <w:name w:val="Body Text 2 Char"/>
@@ -1378,10 +1029,6 @@
     <w:link w:val="BodyText2"/>
     <w:uiPriority w:val="99"/>
     <w:rsid w:val="00AA1D8D"/>
-    <w:rPr>
-      <w:rFonts w:ascii="Arial" w:hAnsi="Arial" w:eastAsia="Arial"/>
-      <w:sz w:val="24"/>
-    </w:rPr>
   </w:style>
   <w:style w:type="paragraph" w:styleId="BodyText3">
     <w:name w:val="Body Text 3"/>
@@ -1394,8 +1041,7 @@
       <w:spacing w:after="120"/>
     </w:pPr>
     <w:rPr>
-      <w:rFonts w:ascii="Arial" w:hAnsi="Arial" w:eastAsia="Arial"/>
-      <w:sz w:val="24"/>
+      <w:sz w:val="16"/>
       <w:szCs w:val="16"/>
     </w:rPr>
   </w:style>
@@ -1406,8 +1052,7 @@
     <w:uiPriority w:val="99"/>
     <w:rsid w:val="00AA1D8D"/>
     <w:rPr>
-      <w:rFonts w:ascii="Arial" w:hAnsi="Arial" w:eastAsia="Arial"/>
-      <w:sz w:val="24"/>
+      <w:sz w:val="16"/>
       <w:szCs w:val="16"/>
     </w:rPr>
   </w:style>
@@ -1421,10 +1066,6 @@
       <w:ind w:left="360" w:hanging="360"/>
       <w:contextualSpacing/>
     </w:pPr>
-    <w:rPr>
-      <w:rFonts w:ascii="Arial" w:hAnsi="Arial" w:eastAsia="Arial"/>
-      <w:sz w:val="24"/>
-    </w:rPr>
   </w:style>
   <w:style w:type="paragraph" w:styleId="List2">
     <w:name w:val="List 2"/>
@@ -1436,10 +1077,6 @@
       <w:ind w:left="720" w:hanging="360"/>
       <w:contextualSpacing/>
     </w:pPr>
-    <w:rPr>
-      <w:rFonts w:ascii="Arial" w:hAnsi="Arial" w:eastAsia="Arial"/>
-      <w:sz w:val="24"/>
-    </w:rPr>
   </w:style>
   <w:style w:type="paragraph" w:styleId="List3">
     <w:name w:val="List 3"/>
@@ -1451,10 +1088,6 @@
       <w:ind w:left="1080" w:hanging="360"/>
       <w:contextualSpacing/>
     </w:pPr>
-    <w:rPr>
-      <w:rFonts w:ascii="Arial" w:hAnsi="Arial" w:eastAsia="Arial"/>
-      <w:sz w:val="24"/>
-    </w:rPr>
   </w:style>
   <w:style w:type="paragraph" w:styleId="ListBullet">
     <w:name w:val="List Bullet"/>
@@ -1468,10 +1101,6 @@
       </w:numPr>
       <w:contextualSpacing/>
     </w:pPr>
-    <w:rPr>
-      <w:rFonts w:ascii="Arial" w:hAnsi="Arial" w:eastAsia="Arial"/>
-      <w:sz w:val="24"/>
-    </w:rPr>
   </w:style>
   <w:style w:type="paragraph" w:styleId="ListBullet2">
     <w:name w:val="List Bullet 2"/>
@@ -1485,10 +1114,6 @@
       </w:numPr>
       <w:contextualSpacing/>
     </w:pPr>
-    <w:rPr>
-      <w:rFonts w:ascii="Arial" w:hAnsi="Arial" w:eastAsia="Arial"/>
-      <w:sz w:val="24"/>
-    </w:rPr>
   </w:style>
   <w:style w:type="paragraph" w:styleId="ListBullet3">
     <w:name w:val="List Bullet 3"/>
@@ -1502,10 +1127,6 @@
       </w:numPr>
       <w:contextualSpacing/>
     </w:pPr>
-    <w:rPr>
-      <w:rFonts w:ascii="Arial" w:hAnsi="Arial" w:eastAsia="Arial"/>
-      <w:sz w:val="24"/>
-    </w:rPr>
   </w:style>
   <w:style w:type="paragraph" w:styleId="ListNumber">
     <w:name w:val="List Number"/>
@@ -1519,10 +1140,6 @@
       </w:numPr>
       <w:contextualSpacing/>
     </w:pPr>
-    <w:rPr>
-      <w:rFonts w:ascii="Arial" w:hAnsi="Arial" w:eastAsia="Arial"/>
-      <w:sz w:val="24"/>
-    </w:rPr>
   </w:style>
   <w:style w:type="paragraph" w:styleId="ListNumber2">
     <w:name w:val="List Number 2"/>
@@ -1536,10 +1153,6 @@
       </w:numPr>
       <w:contextualSpacing/>
     </w:pPr>
-    <w:rPr>
-      <w:rFonts w:ascii="Arial" w:hAnsi="Arial" w:eastAsia="Arial"/>
-      <w:sz w:val="24"/>
-    </w:rPr>
   </w:style>
   <w:style w:type="paragraph" w:styleId="ListNumber3">
     <w:name w:val="List Number 3"/>
@@ -1553,10 +1166,6 @@
       </w:numPr>
       <w:contextualSpacing/>
     </w:pPr>
-    <w:rPr>
-      <w:rFonts w:ascii="Arial" w:hAnsi="Arial" w:eastAsia="Arial"/>
-      <w:sz w:val="24"/>
-    </w:rPr>
   </w:style>
   <w:style w:type="paragraph" w:styleId="ListContinue">
     <w:name w:val="List Continue"/>
@@ -1569,10 +1178,6 @@
       <w:ind w:left="360"/>
       <w:contextualSpacing/>
     </w:pPr>
-    <w:rPr>
-      <w:rFonts w:ascii="Arial" w:hAnsi="Arial" w:eastAsia="Arial"/>
-      <w:sz w:val="24"/>
-    </w:rPr>
   </w:style>
   <w:style w:type="paragraph" w:styleId="ListContinue2">
     <w:name w:val="List Continue 2"/>
@@ -1585,10 +1190,6 @@
       <w:ind w:left="720"/>
       <w:contextualSpacing/>
     </w:pPr>
-    <w:rPr>
-      <w:rFonts w:ascii="Arial" w:hAnsi="Arial" w:eastAsia="Arial"/>
-      <w:sz w:val="24"/>
-    </w:rPr>
   </w:style>
   <w:style w:type="paragraph" w:styleId="ListContinue3">
     <w:name w:val="List Continue 3"/>
@@ -1601,10 +1202,6 @@
       <w:ind w:left="1080"/>
       <w:contextualSpacing/>
     </w:pPr>
-    <w:rPr>
-      <w:rFonts w:ascii="Arial" w:hAnsi="Arial" w:eastAsia="Arial"/>
-      <w:sz w:val="24"/>
-    </w:rPr>
   </w:style>
   <w:style w:type="paragraph" w:styleId="MacroText">
     <w:name w:val="macro"/>
@@ -1624,8 +1221,8 @@
       </w:tabs>
     </w:pPr>
     <w:rPr>
-      <w:rFonts w:ascii="Arial" w:hAnsi="Arial" w:eastAsia="Arial"/>
-      <w:sz w:val="24"/>
+      <w:rFonts w:ascii="Courier" w:hAnsi="Courier"/>
+      <w:sz w:val="20"/>
       <w:szCs w:val="20"/>
     </w:rPr>
   </w:style>
@@ -1636,8 +1233,8 @@
     <w:uiPriority w:val="99"/>
     <w:rsid w:val="0029639D"/>
     <w:rPr>
-      <w:rFonts w:ascii="Arial" w:hAnsi="Arial" w:eastAsia="Arial"/>
-      <w:sz w:val="24"/>
+      <w:rFonts w:ascii="Courier" w:hAnsi="Courier"/>
+      <w:sz w:val="20"/>
       <w:szCs w:val="20"/>
     </w:rPr>
   </w:style>
@@ -1650,10 +1247,9 @@
     <w:qFormat/>
     <w:rsid w:val="00FC693F"/>
     <w:rPr>
-      <w:rFonts w:ascii="Arial" w:hAnsi="Arial" w:eastAsia="Arial"/>
       <w:i/>
       <w:iCs/>
-      <w:sz w:val="24"/>
+      <w:color w:val="000000" w:themeColor="text1"/>
     </w:rPr>
   </w:style>
   <w:style w:type="character" w:customStyle="1" w:styleId="QuoteChar">
@@ -1663,10 +1259,9 @@
     <w:uiPriority w:val="29"/>
     <w:rsid w:val="00FC693F"/>
     <w:rPr>
-      <w:rFonts w:ascii="Arial" w:hAnsi="Arial" w:eastAsia="Arial"/>
       <w:i/>
       <w:iCs/>
-      <w:sz w:val="24"/>
+      <w:color w:val="000000" w:themeColor="text1"/>
     </w:rPr>
   </w:style>
   <w:style w:type="character" w:customStyle="1" w:styleId="Heading4Char">
@@ -1677,12 +1272,12 @@
     <w:semiHidden/>
     <w:rsid w:val="00FC693F"/>
     <w:rPr>
-      <w:rFonts w:asciiTheme="majorHAnsi" w:eastAsiaTheme="majorEastAsia" w:hAnsiTheme="majorHAnsi" w:cstheme="majorBidi" w:ascii="Arial" w:hAnsi="Arial" w:eastAsia="Arial"/>
+      <w:rFonts w:asciiTheme="majorHAnsi" w:eastAsiaTheme="majorEastAsia" w:hAnsiTheme="majorHAnsi" w:cstheme="majorBidi"/>
       <w:b/>
       <w:bCs/>
       <w:i/>
       <w:iCs/>
-      <w:sz w:val="24"/>
+      <w:color w:val="4F81BD" w:themeColor="accent1"/>
     </w:rPr>
   </w:style>
   <w:style w:type="character" w:customStyle="1" w:styleId="Heading5Char">
@@ -1693,8 +1288,8 @@
     <w:semiHidden/>
     <w:rsid w:val="00FC693F"/>
     <w:rPr>
-      <w:rFonts w:asciiTheme="majorHAnsi" w:eastAsiaTheme="majorEastAsia" w:hAnsiTheme="majorHAnsi" w:cstheme="majorBidi" w:ascii="Arial" w:hAnsi="Arial" w:eastAsia="Arial"/>
-      <w:sz w:val="24"/>
+      <w:rFonts w:asciiTheme="majorHAnsi" w:eastAsiaTheme="majorEastAsia" w:hAnsiTheme="majorHAnsi" w:cstheme="majorBidi"/>
+      <w:color w:val="243F60" w:themeColor="accent1" w:themeShade="7F"/>
     </w:rPr>
   </w:style>
   <w:style w:type="character" w:customStyle="1" w:styleId="Heading6Char">
@@ -1705,10 +1300,10 @@
     <w:semiHidden/>
     <w:rsid w:val="00FC693F"/>
     <w:rPr>
-      <w:rFonts w:asciiTheme="majorHAnsi" w:eastAsiaTheme="majorEastAsia" w:hAnsiTheme="majorHAnsi" w:cstheme="majorBidi" w:ascii="Arial" w:hAnsi="Arial" w:eastAsia="Arial"/>
+      <w:rFonts w:asciiTheme="majorHAnsi" w:eastAsiaTheme="majorEastAsia" w:hAnsiTheme="majorHAnsi" w:cstheme="majorBidi"/>
       <w:i/>
       <w:iCs/>
-      <w:sz w:val="24"/>
+      <w:color w:val="243F60" w:themeColor="accent1" w:themeShade="7F"/>
     </w:rPr>
   </w:style>
   <w:style w:type="character" w:customStyle="1" w:styleId="Heading7Char">
@@ -1719,10 +1314,10 @@
     <w:semiHidden/>
     <w:rsid w:val="00FC693F"/>
     <w:rPr>
-      <w:rFonts w:asciiTheme="majorHAnsi" w:eastAsiaTheme="majorEastAsia" w:hAnsiTheme="majorHAnsi" w:cstheme="majorBidi" w:ascii="Arial" w:hAnsi="Arial" w:eastAsia="Arial"/>
+      <w:rFonts w:asciiTheme="majorHAnsi" w:eastAsiaTheme="majorEastAsia" w:hAnsiTheme="majorHAnsi" w:cstheme="majorBidi"/>
       <w:i/>
       <w:iCs/>
-      <w:sz w:val="24"/>
+      <w:color w:val="404040" w:themeColor="text1" w:themeTint="BF"/>
     </w:rPr>
   </w:style>
   <w:style w:type="character" w:customStyle="1" w:styleId="Heading8Char">
@@ -1733,8 +1328,9 @@
     <w:semiHidden/>
     <w:rsid w:val="00FC693F"/>
     <w:rPr>
-      <w:rFonts w:asciiTheme="majorHAnsi" w:eastAsiaTheme="majorEastAsia" w:hAnsiTheme="majorHAnsi" w:cstheme="majorBidi" w:ascii="Arial" w:hAnsi="Arial" w:eastAsia="Arial"/>
-      <w:sz w:val="24"/>
+      <w:rFonts w:asciiTheme="majorHAnsi" w:eastAsiaTheme="majorEastAsia" w:hAnsiTheme="majorHAnsi" w:cstheme="majorBidi"/>
+      <w:color w:val="4F81BD" w:themeColor="accent1"/>
+      <w:sz w:val="20"/>
       <w:szCs w:val="20"/>
     </w:rPr>
   </w:style>
@@ -1746,10 +1342,11 @@
     <w:semiHidden/>
     <w:rsid w:val="00FC693F"/>
     <w:rPr>
-      <w:rFonts w:asciiTheme="majorHAnsi" w:eastAsiaTheme="majorEastAsia" w:hAnsiTheme="majorHAnsi" w:cstheme="majorBidi" w:ascii="Arial" w:hAnsi="Arial" w:eastAsia="Arial"/>
+      <w:rFonts w:asciiTheme="majorHAnsi" w:eastAsiaTheme="majorEastAsia" w:hAnsiTheme="majorHAnsi" w:cstheme="majorBidi"/>
       <w:i/>
       <w:iCs/>
-      <w:sz w:val="24"/>
+      <w:color w:val="404040" w:themeColor="text1" w:themeTint="BF"/>
+      <w:sz w:val="20"/>
       <w:szCs w:val="20"/>
     </w:rPr>
   </w:style>
@@ -1766,10 +1363,10 @@
       <w:spacing w:line="240" w:lineRule="auto"/>
     </w:pPr>
     <w:rPr>
-      <w:rFonts w:ascii="Arial" w:hAnsi="Arial" w:eastAsia="Arial"/>
       <w:b/>
       <w:bCs/>
-      <w:sz w:val="24"/>
+      <w:color w:val="4F81BD" w:themeColor="accent1"/>
+      <w:sz w:val="18"/>
       <w:szCs w:val="18"/>
     </w:rPr>
   </w:style>
@@ -1780,10 +1377,8 @@
     <w:qFormat/>
     <w:rsid w:val="00FC693F"/>
     <w:rPr>
-      <w:rFonts w:ascii="Arial" w:hAnsi="Arial" w:eastAsia="Arial"/>
       <w:b/>
       <w:bCs/>
-      <w:sz w:val="24"/>
     </w:rPr>
   </w:style>
   <w:style w:type="character" w:styleId="Emphasis">
@@ -1793,10 +1388,8 @@
     <w:qFormat/>
     <w:rsid w:val="00FC693F"/>
     <w:rPr>
-      <w:rFonts w:ascii="Arial" w:hAnsi="Arial" w:eastAsia="Arial"/>
       <w:i/>
       <w:iCs/>
-      <w:sz w:val="24"/>
     </w:rPr>
   </w:style>
   <w:style w:type="paragraph" w:styleId="IntenseQuote">
@@ -1815,12 +1408,11 @@
       <w:ind w:left="936" w:right="936"/>
     </w:pPr>
     <w:rPr>
-      <w:rFonts w:ascii="Arial" w:hAnsi="Arial" w:eastAsia="Arial"/>
       <w:b/>
       <w:bCs/>
       <w:i/>
       <w:iCs/>
-      <w:sz w:val="24"/>
+      <w:color w:val="4F81BD" w:themeColor="accent1"/>
     </w:rPr>
   </w:style>
   <w:style w:type="character" w:customStyle="1" w:styleId="IntenseQuoteChar">
@@ -1830,12 +1422,11 @@
     <w:uiPriority w:val="30"/>
     <w:rsid w:val="00FC693F"/>
     <w:rPr>
-      <w:rFonts w:ascii="Arial" w:hAnsi="Arial" w:eastAsia="Arial"/>
       <w:b/>
       <w:bCs/>
       <w:i/>
       <w:iCs/>
-      <w:sz w:val="24"/>
+      <w:color w:val="4F81BD" w:themeColor="accent1"/>
     </w:rPr>
   </w:style>
   <w:style w:type="character" w:styleId="SubtleEmphasis">
@@ -1845,10 +1436,9 @@
     <w:qFormat/>
     <w:rsid w:val="00FC693F"/>
     <w:rPr>
-      <w:rFonts w:ascii="Arial" w:hAnsi="Arial" w:eastAsia="Arial"/>
       <w:i/>
       <w:iCs/>
-      <w:sz w:val="24"/>
+      <w:color w:val="808080" w:themeColor="text1" w:themeTint="7F"/>
     </w:rPr>
   </w:style>
   <w:style w:type="character" w:styleId="IntenseEmphasis">
@@ -1858,12 +1448,11 @@
     <w:qFormat/>
     <w:rsid w:val="00FC693F"/>
     <w:rPr>
-      <w:rFonts w:ascii="Arial" w:hAnsi="Arial" w:eastAsia="Arial"/>
       <w:b/>
       <w:bCs/>
       <w:i/>
       <w:iCs/>
-      <w:sz w:val="24"/>
+      <w:color w:val="4F81BD" w:themeColor="accent1"/>
     </w:rPr>
   </w:style>
   <w:style w:type="character" w:styleId="SubtleReference">
@@ -1873,9 +1462,8 @@
     <w:qFormat/>
     <w:rsid w:val="00FC693F"/>
     <w:rPr>
-      <w:rFonts w:ascii="Arial" w:hAnsi="Arial" w:eastAsia="Arial"/>
       <w:smallCaps/>
-      <w:sz w:val="24"/>
+      <w:color w:val="C0504D" w:themeColor="accent2"/>
       <w:u w:val="single"/>
     </w:rPr>
   </w:style>
@@ -1886,12 +1474,11 @@
     <w:qFormat/>
     <w:rsid w:val="00FC693F"/>
     <w:rPr>
-      <w:rFonts w:ascii="Arial" w:hAnsi="Arial" w:eastAsia="Arial"/>
       <w:b/>
       <w:bCs/>
       <w:smallCaps/>
+      <w:color w:val="C0504D" w:themeColor="accent2"/>
       <w:spacing w:val="5"/>
-      <w:sz w:val="24"/>
       <w:u w:val="single"/>
     </w:rPr>
   </w:style>
@@ -1902,12 +1489,10 @@
     <w:qFormat/>
     <w:rsid w:val="00FC693F"/>
     <w:rPr>
-      <w:rFonts w:ascii="Arial" w:hAnsi="Arial" w:eastAsia="Arial"/>
       <w:b/>
       <w:bCs/>
       <w:smallCaps/>
       <w:spacing w:val="5"/>
-      <w:sz w:val="24"/>
     </w:rPr>
   </w:style>
   <w:style w:type="paragraph" w:styleId="TOCHeading">
@@ -1922,10 +1507,6 @@
     <w:pPr>
       <w:outlineLvl w:val="9"/>
     </w:pPr>
-    <w:rPr>
-      <w:rFonts w:ascii="Arial" w:hAnsi="Arial" w:eastAsia="Arial"/>
-      <w:sz w:val="24"/>
-    </w:rPr>
   </w:style>
   <w:style w:type="table" w:styleId="TableGrid">
     <w:name w:val="Table Grid"/>
@@ -1935,10 +1516,6 @@
     <w:pPr>
       <w:spacing w:after="0" w:line="240" w:lineRule="auto"/>
     </w:pPr>
-    <w:rPr>
-      <w:rFonts w:ascii="Arial" w:hAnsi="Arial" w:eastAsia="Arial"/>
-      <w:sz w:val="24"/>
-    </w:rPr>
     <w:tblPr>
       <w:tblInd w:w="0" w:type="dxa"/>
       <w:tblBorders>
@@ -1966,8 +1543,7 @@
       <w:spacing w:after="0" w:line="240" w:lineRule="auto"/>
     </w:pPr>
     <w:rPr>
-      <w:rFonts w:ascii="Arial" w:hAnsi="Arial" w:eastAsia="Arial"/>
-      <w:sz w:val="24"/>
+      <w:color w:val="000000" w:themeColor="text1" w:themeShade="BF"/>
     </w:rPr>
     <w:tblPr>
       <w:tblStyleRowBandSize w:val="1"/>
@@ -2070,8 +1646,7 @@
       <w:spacing w:after="0" w:line="240" w:lineRule="auto"/>
     </w:pPr>
     <w:rPr>
-      <w:rFonts w:ascii="Arial" w:hAnsi="Arial" w:eastAsia="Arial"/>
-      <w:sz w:val="24"/>
+      <w:color w:val="365F91" w:themeColor="accent1" w:themeShade="BF"/>
     </w:rPr>
     <w:tblPr>
       <w:tblStyleRowBandSize w:val="1"/>
@@ -2174,8 +1749,7 @@
       <w:spacing w:after="0" w:line="240" w:lineRule="auto"/>
     </w:pPr>
     <w:rPr>
-      <w:rFonts w:ascii="Arial" w:hAnsi="Arial" w:eastAsia="Arial"/>
-      <w:sz w:val="24"/>
+      <w:color w:val="943634" w:themeColor="accent2" w:themeShade="BF"/>
     </w:rPr>
     <w:tblPr>
       <w:tblStyleRowBandSize w:val="1"/>
@@ -2278,8 +1852,7 @@
       <w:spacing w:after="0" w:line="240" w:lineRule="auto"/>
     </w:pPr>
     <w:rPr>
-      <w:rFonts w:ascii="Arial" w:hAnsi="Arial" w:eastAsia="Arial"/>
-      <w:sz w:val="24"/>
+      <w:color w:val="76923C" w:themeColor="accent3" w:themeShade="BF"/>
     </w:rPr>
     <w:tblPr>
       <w:tblStyleRowBandSize w:val="1"/>
@@ -2382,8 +1955,7 @@
       <w:spacing w:after="0" w:line="240" w:lineRule="auto"/>
     </w:pPr>
     <w:rPr>
-      <w:rFonts w:ascii="Arial" w:hAnsi="Arial" w:eastAsia="Arial"/>
-      <w:sz w:val="24"/>
+      <w:color w:val="5F497A" w:themeColor="accent4" w:themeShade="BF"/>
     </w:rPr>
     <w:tblPr>
       <w:tblStyleRowBandSize w:val="1"/>
@@ -2486,8 +2058,7 @@
       <w:spacing w:after="0" w:line="240" w:lineRule="auto"/>
     </w:pPr>
     <w:rPr>
-      <w:rFonts w:ascii="Arial" w:hAnsi="Arial" w:eastAsia="Arial"/>
-      <w:sz w:val="24"/>
+      <w:color w:val="31849B" w:themeColor="accent5" w:themeShade="BF"/>
     </w:rPr>
     <w:tblPr>
       <w:tblStyleRowBandSize w:val="1"/>
@@ -2590,8 +2161,7 @@
       <w:spacing w:after="0" w:line="240" w:lineRule="auto"/>
     </w:pPr>
     <w:rPr>
-      <w:rFonts w:ascii="Arial" w:hAnsi="Arial" w:eastAsia="Arial"/>
-      <w:sz w:val="24"/>
+      <w:color w:val="E36C0A" w:themeColor="accent6" w:themeShade="BF"/>
     </w:rPr>
     <w:tblPr>
       <w:tblStyleRowBandSize w:val="1"/>
@@ -2693,10 +2263,6 @@
     <w:pPr>
       <w:spacing w:after="0" w:line="240" w:lineRule="auto"/>
     </w:pPr>
-    <w:rPr>
-      <w:rFonts w:ascii="Arial" w:hAnsi="Arial" w:eastAsia="Arial"/>
-      <w:sz w:val="24"/>
-    </w:rPr>
     <w:tblPr>
       <w:tblStyleRowBandSize w:val="1"/>
       <w:tblStyleColBandSize w:val="1"/>
@@ -2789,10 +2355,6 @@
     <w:pPr>
       <w:spacing w:after="0" w:line="240" w:lineRule="auto"/>
     </w:pPr>
-    <w:rPr>
-      <w:rFonts w:ascii="Arial" w:hAnsi="Arial" w:eastAsia="Arial"/>
-      <w:sz w:val="24"/>
-    </w:rPr>
     <w:tblPr>
       <w:tblStyleRowBandSize w:val="1"/>
       <w:tblStyleColBandSize w:val="1"/>
@@ -2885,10 +2447,6 @@
     <w:pPr>
       <w:spacing w:after="0" w:line="240" w:lineRule="auto"/>
     </w:pPr>
-    <w:rPr>
-      <w:rFonts w:ascii="Arial" w:hAnsi="Arial" w:eastAsia="Arial"/>
-      <w:sz w:val="24"/>
-    </w:rPr>
     <w:tblPr>
       <w:tblStyleRowBandSize w:val="1"/>
       <w:tblStyleColBandSize w:val="1"/>
@@ -2981,10 +2539,6 @@
     <w:pPr>
       <w:spacing w:after="0" w:line="240" w:lineRule="auto"/>
     </w:pPr>
-    <w:rPr>
-      <w:rFonts w:ascii="Arial" w:hAnsi="Arial" w:eastAsia="Arial"/>
-      <w:sz w:val="24"/>
-    </w:rPr>
     <w:tblPr>
       <w:tblStyleRowBandSize w:val="1"/>
       <w:tblStyleColBandSize w:val="1"/>
@@ -3077,10 +2631,6 @@
     <w:pPr>
       <w:spacing w:after="0" w:line="240" w:lineRule="auto"/>
     </w:pPr>
-    <w:rPr>
-      <w:rFonts w:ascii="Arial" w:hAnsi="Arial" w:eastAsia="Arial"/>
-      <w:sz w:val="24"/>
-    </w:rPr>
     <w:tblPr>
       <w:tblStyleRowBandSize w:val="1"/>
       <w:tblStyleColBandSize w:val="1"/>
@@ -3173,10 +2723,6 @@
     <w:pPr>
       <w:spacing w:after="0" w:line="240" w:lineRule="auto"/>
     </w:pPr>
-    <w:rPr>
-      <w:rFonts w:ascii="Arial" w:hAnsi="Arial" w:eastAsia="Arial"/>
-      <w:sz w:val="24"/>
-    </w:rPr>
     <w:tblPr>
       <w:tblStyleRowBandSize w:val="1"/>
       <w:tblStyleColBandSize w:val="1"/>
@@ -3269,10 +2815,6 @@
     <w:pPr>
       <w:spacing w:after="0" w:line="240" w:lineRule="auto"/>
     </w:pPr>
-    <w:rPr>
-      <w:rFonts w:ascii="Arial" w:hAnsi="Arial" w:eastAsia="Arial"/>
-      <w:sz w:val="24"/>
-    </w:rPr>
     <w:tblPr>
       <w:tblStyleRowBandSize w:val="1"/>
       <w:tblStyleColBandSize w:val="1"/>
@@ -3365,10 +2907,6 @@
     <w:pPr>
       <w:spacing w:after="0" w:line="240" w:lineRule="auto"/>
     </w:pPr>
-    <w:rPr>
-      <w:rFonts w:ascii="Arial" w:hAnsi="Arial" w:eastAsia="Arial"/>
-      <w:sz w:val="24"/>
-    </w:rPr>
     <w:tblPr>
       <w:tblStyleRowBandSize w:val="1"/>
       <w:tblStyleColBandSize w:val="1"/>
@@ -3499,10 +3037,6 @@
     <w:pPr>
       <w:spacing w:after="0" w:line="240" w:lineRule="auto"/>
     </w:pPr>
-    <w:rPr>
-      <w:rFonts w:ascii="Arial" w:hAnsi="Arial" w:eastAsia="Arial"/>
-      <w:sz w:val="24"/>
-    </w:rPr>
     <w:tblPr>
       <w:tblStyleRowBandSize w:val="1"/>
       <w:tblStyleColBandSize w:val="1"/>
@@ -3633,10 +3167,6 @@
     <w:pPr>
       <w:spacing w:after="0" w:line="240" w:lineRule="auto"/>
     </w:pPr>
-    <w:rPr>
-      <w:rFonts w:ascii="Arial" w:hAnsi="Arial" w:eastAsia="Arial"/>
-      <w:sz w:val="24"/>
-    </w:rPr>
     <w:tblPr>
       <w:tblStyleRowBandSize w:val="1"/>
       <w:tblStyleColBandSize w:val="1"/>
@@ -3767,10 +3297,6 @@
     <w:pPr>
       <w:spacing w:after="0" w:line="240" w:lineRule="auto"/>
     </w:pPr>
-    <w:rPr>
-      <w:rFonts w:ascii="Arial" w:hAnsi="Arial" w:eastAsia="Arial"/>
-      <w:sz w:val="24"/>
-    </w:rPr>
     <w:tblPr>
       <w:tblStyleRowBandSize w:val="1"/>
       <w:tblStyleColBandSize w:val="1"/>
@@ -3901,10 +3427,6 @@
     <w:pPr>
       <w:spacing w:after="0" w:line="240" w:lineRule="auto"/>
     </w:pPr>
-    <w:rPr>
-      <w:rFonts w:ascii="Arial" w:hAnsi="Arial" w:eastAsia="Arial"/>
-      <w:sz w:val="24"/>
-    </w:rPr>
     <w:tblPr>
       <w:tblStyleRowBandSize w:val="1"/>
       <w:tblStyleColBandSize w:val="1"/>
@@ -4035,10 +3557,6 @@
     <w:pPr>
       <w:spacing w:after="0" w:line="240" w:lineRule="auto"/>
     </w:pPr>
-    <w:rPr>
-      <w:rFonts w:ascii="Arial" w:hAnsi="Arial" w:eastAsia="Arial"/>
-      <w:sz w:val="24"/>
-    </w:rPr>
     <w:tblPr>
       <w:tblStyleRowBandSize w:val="1"/>
       <w:tblStyleColBandSize w:val="1"/>
@@ -4169,10 +3687,6 @@
     <w:pPr>
       <w:spacing w:after="0" w:line="240" w:lineRule="auto"/>
     </w:pPr>
-    <w:rPr>
-      <w:rFonts w:ascii="Arial" w:hAnsi="Arial" w:eastAsia="Arial"/>
-      <w:sz w:val="24"/>
-    </w:rPr>
     <w:tblPr>
       <w:tblStyleRowBandSize w:val="1"/>
       <w:tblStyleColBandSize w:val="1"/>
@@ -4303,10 +3817,6 @@
     <w:pPr>
       <w:spacing w:after="0" w:line="240" w:lineRule="auto"/>
     </w:pPr>
-    <w:rPr>
-      <w:rFonts w:ascii="Arial" w:hAnsi="Arial" w:eastAsia="Arial"/>
-      <w:sz w:val="24"/>
-    </w:rPr>
     <w:tblPr>
       <w:tblStyleRowBandSize w:val="1"/>
       <w:tblStyleColBandSize w:val="1"/>
@@ -4413,10 +3923,6 @@
     <w:pPr>
       <w:spacing w:after="0" w:line="240" w:lineRule="auto"/>
     </w:pPr>
-    <w:rPr>
-      <w:rFonts w:ascii="Arial" w:hAnsi="Arial" w:eastAsia="Arial"/>
-      <w:sz w:val="24"/>
-    </w:rPr>
     <w:tblPr>
       <w:tblStyleRowBandSize w:val="1"/>
       <w:tblStyleColBandSize w:val="1"/>
@@ -4523,10 +4029,6 @@
     <w:pPr>
       <w:spacing w:after="0" w:line="240" w:lineRule="auto"/>
     </w:pPr>
-    <w:rPr>
-      <w:rFonts w:ascii="Arial" w:hAnsi="Arial" w:eastAsia="Arial"/>
-      <w:sz w:val="24"/>
-    </w:rPr>
     <w:tblPr>
       <w:tblStyleRowBandSize w:val="1"/>
       <w:tblStyleColBandSize w:val="1"/>
@@ -4633,10 +4135,6 @@
     <w:pPr>
       <w:spacing w:after="0" w:line="240" w:lineRule="auto"/>
     </w:pPr>
-    <w:rPr>
-      <w:rFonts w:ascii="Arial" w:hAnsi="Arial" w:eastAsia="Arial"/>
-      <w:sz w:val="24"/>
-    </w:rPr>
     <w:tblPr>
       <w:tblStyleRowBandSize w:val="1"/>
       <w:tblStyleColBandSize w:val="1"/>
@@ -4743,10 +4241,6 @@
     <w:pPr>
       <w:spacing w:after="0" w:line="240" w:lineRule="auto"/>
     </w:pPr>
-    <w:rPr>
-      <w:rFonts w:ascii="Arial" w:hAnsi="Arial" w:eastAsia="Arial"/>
-      <w:sz w:val="24"/>
-    </w:rPr>
     <w:tblPr>
       <w:tblStyleRowBandSize w:val="1"/>
       <w:tblStyleColBandSize w:val="1"/>
@@ -4853,10 +4347,6 @@
     <w:pPr>
       <w:spacing w:after="0" w:line="240" w:lineRule="auto"/>
     </w:pPr>
-    <w:rPr>
-      <w:rFonts w:ascii="Arial" w:hAnsi="Arial" w:eastAsia="Arial"/>
-      <w:sz w:val="24"/>
-    </w:rPr>
     <w:tblPr>
       <w:tblStyleRowBandSize w:val="1"/>
       <w:tblStyleColBandSize w:val="1"/>
@@ -4963,10 +4453,6 @@
     <w:pPr>
       <w:spacing w:after="0" w:line="240" w:lineRule="auto"/>
     </w:pPr>
-    <w:rPr>
-      <w:rFonts w:ascii="Arial" w:hAnsi="Arial" w:eastAsia="Arial"/>
-      <w:sz w:val="24"/>
-    </w:rPr>
     <w:tblPr>
       <w:tblStyleRowBandSize w:val="1"/>
       <w:tblStyleColBandSize w:val="1"/>
@@ -5073,10 +4559,6 @@
     <w:pPr>
       <w:spacing w:after="0" w:line="240" w:lineRule="auto"/>
     </w:pPr>
-    <w:rPr>
-      <w:rFonts w:ascii="Arial" w:hAnsi="Arial" w:eastAsia="Arial"/>
-      <w:sz w:val="24"/>
-    </w:rPr>
     <w:tblPr>
       <w:tblStyleRowBandSize w:val="1"/>
       <w:tblStyleColBandSize w:val="1"/>
@@ -5226,10 +4708,6 @@
     <w:pPr>
       <w:spacing w:after="0" w:line="240" w:lineRule="auto"/>
     </w:pPr>
-    <w:rPr>
-      <w:rFonts w:ascii="Arial" w:hAnsi="Arial" w:eastAsia="Arial"/>
-      <w:sz w:val="24"/>
-    </w:rPr>
     <w:tblPr>
       <w:tblStyleRowBandSize w:val="1"/>
       <w:tblStyleColBandSize w:val="1"/>
@@ -5379,10 +4857,6 @@
     <w:pPr>
       <w:spacing w:after="0" w:line="240" w:lineRule="auto"/>
     </w:pPr>
-    <w:rPr>
-      <w:rFonts w:ascii="Arial" w:hAnsi="Arial" w:eastAsia="Arial"/>
-      <w:sz w:val="24"/>
-    </w:rPr>
     <w:tblPr>
       <w:tblStyleRowBandSize w:val="1"/>
       <w:tblStyleColBandSize w:val="1"/>
@@ -5532,10 +5006,6 @@
     <w:pPr>
       <w:spacing w:after="0" w:line="240" w:lineRule="auto"/>
     </w:pPr>
-    <w:rPr>
-      <w:rFonts w:ascii="Arial" w:hAnsi="Arial" w:eastAsia="Arial"/>
-      <w:sz w:val="24"/>
-    </w:rPr>
     <w:tblPr>
       <w:tblStyleRowBandSize w:val="1"/>
       <w:tblStyleColBandSize w:val="1"/>
@@ -5685,10 +5155,6 @@
     <w:pPr>
       <w:spacing w:after="0" w:line="240" w:lineRule="auto"/>
     </w:pPr>
-    <w:rPr>
-      <w:rFonts w:ascii="Arial" w:hAnsi="Arial" w:eastAsia="Arial"/>
-      <w:sz w:val="24"/>
-    </w:rPr>
     <w:tblPr>
       <w:tblStyleRowBandSize w:val="1"/>
       <w:tblStyleColBandSize w:val="1"/>
@@ -5838,10 +5304,6 @@
     <w:pPr>
       <w:spacing w:after="0" w:line="240" w:lineRule="auto"/>
     </w:pPr>
-    <w:rPr>
-      <w:rFonts w:ascii="Arial" w:hAnsi="Arial" w:eastAsia="Arial"/>
-      <w:sz w:val="24"/>
-    </w:rPr>
     <w:tblPr>
       <w:tblStyleRowBandSize w:val="1"/>
       <w:tblStyleColBandSize w:val="1"/>
@@ -5991,10 +5453,6 @@
     <w:pPr>
       <w:spacing w:after="0" w:line="240" w:lineRule="auto"/>
     </w:pPr>
-    <w:rPr>
-      <w:rFonts w:ascii="Arial" w:hAnsi="Arial" w:eastAsia="Arial"/>
-      <w:sz w:val="24"/>
-    </w:rPr>
     <w:tblPr>
       <w:tblStyleRowBandSize w:val="1"/>
       <w:tblStyleColBandSize w:val="1"/>
@@ -6145,8 +5603,7 @@
       <w:spacing w:after="0" w:line="240" w:lineRule="auto"/>
     </w:pPr>
     <w:rPr>
-      <w:rFonts w:ascii="Arial" w:hAnsi="Arial" w:eastAsia="Arial"/>
-      <w:sz w:val="24"/>
+      <w:color w:val="000000" w:themeColor="text1"/>
     </w:rPr>
     <w:tblPr>
       <w:tblStyleRowBandSize w:val="1"/>
@@ -6230,8 +5687,7 @@
       <w:spacing w:after="0" w:line="240" w:lineRule="auto"/>
     </w:pPr>
     <w:rPr>
-      <w:rFonts w:ascii="Arial" w:hAnsi="Arial" w:eastAsia="Arial"/>
-      <w:sz w:val="24"/>
+      <w:color w:val="000000" w:themeColor="text1"/>
     </w:rPr>
     <w:tblPr>
       <w:tblStyleRowBandSize w:val="1"/>
@@ -6315,8 +5771,7 @@
       <w:spacing w:after="0" w:line="240" w:lineRule="auto"/>
     </w:pPr>
     <w:rPr>
-      <w:rFonts w:ascii="Arial" w:hAnsi="Arial" w:eastAsia="Arial"/>
-      <w:sz w:val="24"/>
+      <w:color w:val="000000" w:themeColor="text1"/>
     </w:rPr>
     <w:tblPr>
       <w:tblStyleRowBandSize w:val="1"/>
@@ -6400,8 +5855,7 @@
       <w:spacing w:after="0" w:line="240" w:lineRule="auto"/>
     </w:pPr>
     <w:rPr>
-      <w:rFonts w:ascii="Arial" w:hAnsi="Arial" w:eastAsia="Arial"/>
-      <w:sz w:val="24"/>
+      <w:color w:val="000000" w:themeColor="text1"/>
     </w:rPr>
     <w:tblPr>
       <w:tblStyleRowBandSize w:val="1"/>
@@ -6485,8 +5939,7 @@
       <w:spacing w:after="0" w:line="240" w:lineRule="auto"/>
     </w:pPr>
     <w:rPr>
-      <w:rFonts w:ascii="Arial" w:hAnsi="Arial" w:eastAsia="Arial"/>
-      <w:sz w:val="24"/>
+      <w:color w:val="000000" w:themeColor="text1"/>
     </w:rPr>
     <w:tblPr>
       <w:tblStyleRowBandSize w:val="1"/>
@@ -6570,8 +6023,7 @@
       <w:spacing w:after="0" w:line="240" w:lineRule="auto"/>
     </w:pPr>
     <w:rPr>
-      <w:rFonts w:ascii="Arial" w:hAnsi="Arial" w:eastAsia="Arial"/>
-      <w:sz w:val="24"/>
+      <w:color w:val="000000" w:themeColor="text1"/>
     </w:rPr>
     <w:tblPr>
       <w:tblStyleRowBandSize w:val="1"/>
@@ -6655,8 +6107,7 @@
       <w:spacing w:after="0" w:line="240" w:lineRule="auto"/>
     </w:pPr>
     <w:rPr>
-      <w:rFonts w:ascii="Arial" w:hAnsi="Arial" w:eastAsia="Arial"/>
-      <w:sz w:val="24"/>
+      <w:color w:val="000000" w:themeColor="text1"/>
     </w:rPr>
     <w:tblPr>
       <w:tblStyleRowBandSize w:val="1"/>
@@ -6740,8 +6191,8 @@
       <w:spacing w:after="0" w:line="240" w:lineRule="auto"/>
     </w:pPr>
     <w:rPr>
-      <w:rFonts w:asciiTheme="majorHAnsi" w:eastAsiaTheme="majorEastAsia" w:hAnsiTheme="majorHAnsi" w:cstheme="majorBidi" w:ascii="Arial" w:hAnsi="Arial" w:eastAsia="Arial"/>
-      <w:sz w:val="24"/>
+      <w:rFonts w:asciiTheme="majorHAnsi" w:eastAsiaTheme="majorEastAsia" w:hAnsiTheme="majorHAnsi" w:cstheme="majorBidi"/>
+      <w:color w:val="000000" w:themeColor="text1"/>
     </w:rPr>
     <w:tblPr>
       <w:tblStyleRowBandSize w:val="1"/>
@@ -6868,8 +6319,8 @@
       <w:spacing w:after="0" w:line="240" w:lineRule="auto"/>
     </w:pPr>
     <w:rPr>
-      <w:rFonts w:asciiTheme="majorHAnsi" w:eastAsiaTheme="majorEastAsia" w:hAnsiTheme="majorHAnsi" w:cstheme="majorBidi" w:ascii="Arial" w:hAnsi="Arial" w:eastAsia="Arial"/>
-      <w:sz w:val="24"/>
+      <w:rFonts w:asciiTheme="majorHAnsi" w:eastAsiaTheme="majorEastAsia" w:hAnsiTheme="majorHAnsi" w:cstheme="majorBidi"/>
+      <w:color w:val="000000" w:themeColor="text1"/>
     </w:rPr>
     <w:tblPr>
       <w:tblStyleRowBandSize w:val="1"/>
@@ -6996,8 +6447,8 @@
       <w:spacing w:after="0" w:line="240" w:lineRule="auto"/>
     </w:pPr>
     <w:rPr>
-      <w:rFonts w:asciiTheme="majorHAnsi" w:eastAsiaTheme="majorEastAsia" w:hAnsiTheme="majorHAnsi" w:cstheme="majorBidi" w:ascii="Arial" w:hAnsi="Arial" w:eastAsia="Arial"/>
-      <w:sz w:val="24"/>
+      <w:rFonts w:asciiTheme="majorHAnsi" w:eastAsiaTheme="majorEastAsia" w:hAnsiTheme="majorHAnsi" w:cstheme="majorBidi"/>
+      <w:color w:val="000000" w:themeColor="text1"/>
     </w:rPr>
     <w:tblPr>
       <w:tblStyleRowBandSize w:val="1"/>
@@ -7124,8 +6575,8 @@
       <w:spacing w:after="0" w:line="240" w:lineRule="auto"/>
     </w:pPr>
     <w:rPr>
-      <w:rFonts w:asciiTheme="majorHAnsi" w:eastAsiaTheme="majorEastAsia" w:hAnsiTheme="majorHAnsi" w:cstheme="majorBidi" w:ascii="Arial" w:hAnsi="Arial" w:eastAsia="Arial"/>
-      <w:sz w:val="24"/>
+      <w:rFonts w:asciiTheme="majorHAnsi" w:eastAsiaTheme="majorEastAsia" w:hAnsiTheme="majorHAnsi" w:cstheme="majorBidi"/>
+      <w:color w:val="000000" w:themeColor="text1"/>
     </w:rPr>
     <w:tblPr>
       <w:tblStyleRowBandSize w:val="1"/>
@@ -7252,8 +6703,8 @@
       <w:spacing w:after="0" w:line="240" w:lineRule="auto"/>
     </w:pPr>
     <w:rPr>
-      <w:rFonts w:asciiTheme="majorHAnsi" w:eastAsiaTheme="majorEastAsia" w:hAnsiTheme="majorHAnsi" w:cstheme="majorBidi" w:ascii="Arial" w:hAnsi="Arial" w:eastAsia="Arial"/>
-      <w:sz w:val="24"/>
+      <w:rFonts w:asciiTheme="majorHAnsi" w:eastAsiaTheme="majorEastAsia" w:hAnsiTheme="majorHAnsi" w:cstheme="majorBidi"/>
+      <w:color w:val="000000" w:themeColor="text1"/>
     </w:rPr>
     <w:tblPr>
       <w:tblStyleRowBandSize w:val="1"/>
@@ -7380,8 +6831,8 @@
       <w:spacing w:after="0" w:line="240" w:lineRule="auto"/>
     </w:pPr>
     <w:rPr>
-      <w:rFonts w:asciiTheme="majorHAnsi" w:eastAsiaTheme="majorEastAsia" w:hAnsiTheme="majorHAnsi" w:cstheme="majorBidi" w:ascii="Arial" w:hAnsi="Arial" w:eastAsia="Arial"/>
-      <w:sz w:val="24"/>
+      <w:rFonts w:asciiTheme="majorHAnsi" w:eastAsiaTheme="majorEastAsia" w:hAnsiTheme="majorHAnsi" w:cstheme="majorBidi"/>
+      <w:color w:val="000000" w:themeColor="text1"/>
     </w:rPr>
     <w:tblPr>
       <w:tblStyleRowBandSize w:val="1"/>
@@ -7508,8 +6959,8 @@
       <w:spacing w:after="0" w:line="240" w:lineRule="auto"/>
     </w:pPr>
     <w:rPr>
-      <w:rFonts w:asciiTheme="majorHAnsi" w:eastAsiaTheme="majorEastAsia" w:hAnsiTheme="majorHAnsi" w:cstheme="majorBidi" w:ascii="Arial" w:hAnsi="Arial" w:eastAsia="Arial"/>
-      <w:sz w:val="24"/>
+      <w:rFonts w:asciiTheme="majorHAnsi" w:eastAsiaTheme="majorEastAsia" w:hAnsiTheme="majorHAnsi" w:cstheme="majorBidi"/>
+      <w:color w:val="000000" w:themeColor="text1"/>
     </w:rPr>
     <w:tblPr>
       <w:tblStyleRowBandSize w:val="1"/>
@@ -7635,10 +7086,6 @@
     <w:pPr>
       <w:spacing w:after="0" w:line="240" w:lineRule="auto"/>
     </w:pPr>
-    <w:rPr>
-      <w:rFonts w:ascii="Arial" w:hAnsi="Arial" w:eastAsia="Arial"/>
-      <w:sz w:val="24"/>
-    </w:rPr>
     <w:tblPr>
       <w:tblStyleRowBandSize w:val="1"/>
       <w:tblStyleColBandSize w:val="1"/>
@@ -7712,10 +7159,6 @@
     <w:pPr>
       <w:spacing w:after="0" w:line="240" w:lineRule="auto"/>
     </w:pPr>
-    <w:rPr>
-      <w:rFonts w:ascii="Arial" w:hAnsi="Arial" w:eastAsia="Arial"/>
-      <w:sz w:val="24"/>
-    </w:rPr>
     <w:tblPr>
       <w:tblStyleRowBandSize w:val="1"/>
       <w:tblStyleColBandSize w:val="1"/>
@@ -7789,10 +7232,6 @@
     <w:pPr>
       <w:spacing w:after="0" w:line="240" w:lineRule="auto"/>
     </w:pPr>
-    <w:rPr>
-      <w:rFonts w:ascii="Arial" w:hAnsi="Arial" w:eastAsia="Arial"/>
-      <w:sz w:val="24"/>
-    </w:rPr>
     <w:tblPr>
       <w:tblStyleRowBandSize w:val="1"/>
       <w:tblStyleColBandSize w:val="1"/>
@@ -7866,10 +7305,6 @@
     <w:pPr>
       <w:spacing w:after="0" w:line="240" w:lineRule="auto"/>
     </w:pPr>
-    <w:rPr>
-      <w:rFonts w:ascii="Arial" w:hAnsi="Arial" w:eastAsia="Arial"/>
-      <w:sz w:val="24"/>
-    </w:rPr>
     <w:tblPr>
       <w:tblStyleRowBandSize w:val="1"/>
       <w:tblStyleColBandSize w:val="1"/>
@@ -7943,10 +7378,6 @@
     <w:pPr>
       <w:spacing w:after="0" w:line="240" w:lineRule="auto"/>
     </w:pPr>
-    <w:rPr>
-      <w:rFonts w:ascii="Arial" w:hAnsi="Arial" w:eastAsia="Arial"/>
-      <w:sz w:val="24"/>
-    </w:rPr>
     <w:tblPr>
       <w:tblStyleRowBandSize w:val="1"/>
       <w:tblStyleColBandSize w:val="1"/>
@@ -8020,10 +7451,6 @@
     <w:pPr>
       <w:spacing w:after="0" w:line="240" w:lineRule="auto"/>
     </w:pPr>
-    <w:rPr>
-      <w:rFonts w:ascii="Arial" w:hAnsi="Arial" w:eastAsia="Arial"/>
-      <w:sz w:val="24"/>
-    </w:rPr>
     <w:tblPr>
       <w:tblStyleRowBandSize w:val="1"/>
       <w:tblStyleColBandSize w:val="1"/>
@@ -8097,10 +7524,6 @@
     <w:pPr>
       <w:spacing w:after="0" w:line="240" w:lineRule="auto"/>
     </w:pPr>
-    <w:rPr>
-      <w:rFonts w:ascii="Arial" w:hAnsi="Arial" w:eastAsia="Arial"/>
-      <w:sz w:val="24"/>
-    </w:rPr>
     <w:tblPr>
       <w:tblStyleRowBandSize w:val="1"/>
       <w:tblStyleColBandSize w:val="1"/>
@@ -8175,8 +7598,8 @@
       <w:spacing w:after="0" w:line="240" w:lineRule="auto"/>
     </w:pPr>
     <w:rPr>
-      <w:rFonts w:asciiTheme="majorHAnsi" w:eastAsiaTheme="majorEastAsia" w:hAnsiTheme="majorHAnsi" w:cstheme="majorBidi" w:ascii="Arial" w:hAnsi="Arial" w:eastAsia="Arial"/>
-      <w:sz w:val="24"/>
+      <w:rFonts w:asciiTheme="majorHAnsi" w:eastAsiaTheme="majorEastAsia" w:hAnsiTheme="majorHAnsi" w:cstheme="majorBidi"/>
+      <w:color w:val="000000" w:themeColor="text1"/>
     </w:rPr>
     <w:tblPr>
       <w:tblStyleRowBandSize w:val="1"/>
@@ -8300,8 +7723,8 @@
       <w:spacing w:after="0" w:line="240" w:lineRule="auto"/>
     </w:pPr>
     <w:rPr>
-      <w:rFonts w:asciiTheme="majorHAnsi" w:eastAsiaTheme="majorEastAsia" w:hAnsiTheme="majorHAnsi" w:cstheme="majorBidi" w:ascii="Arial" w:hAnsi="Arial" w:eastAsia="Arial"/>
-      <w:sz w:val="24"/>
+      <w:rFonts w:asciiTheme="majorHAnsi" w:eastAsiaTheme="majorEastAsia" w:hAnsiTheme="majorHAnsi" w:cstheme="majorBidi"/>
+      <w:color w:val="000000" w:themeColor="text1"/>
     </w:rPr>
     <w:tblPr>
       <w:tblStyleRowBandSize w:val="1"/>
@@ -8425,8 +7848,8 @@
       <w:spacing w:after="0" w:line="240" w:lineRule="auto"/>
     </w:pPr>
     <w:rPr>
-      <w:rFonts w:asciiTheme="majorHAnsi" w:eastAsiaTheme="majorEastAsia" w:hAnsiTheme="majorHAnsi" w:cstheme="majorBidi" w:ascii="Arial" w:hAnsi="Arial" w:eastAsia="Arial"/>
-      <w:sz w:val="24"/>
+      <w:rFonts w:asciiTheme="majorHAnsi" w:eastAsiaTheme="majorEastAsia" w:hAnsiTheme="majorHAnsi" w:cstheme="majorBidi"/>
+      <w:color w:val="000000" w:themeColor="text1"/>
     </w:rPr>
     <w:tblPr>
       <w:tblStyleRowBandSize w:val="1"/>
@@ -8550,8 +7973,8 @@
       <w:spacing w:after="0" w:line="240" w:lineRule="auto"/>
     </w:pPr>
     <w:rPr>
-      <w:rFonts w:asciiTheme="majorHAnsi" w:eastAsiaTheme="majorEastAsia" w:hAnsiTheme="majorHAnsi" w:cstheme="majorBidi" w:ascii="Arial" w:hAnsi="Arial" w:eastAsia="Arial"/>
-      <w:sz w:val="24"/>
+      <w:rFonts w:asciiTheme="majorHAnsi" w:eastAsiaTheme="majorEastAsia" w:hAnsiTheme="majorHAnsi" w:cstheme="majorBidi"/>
+      <w:color w:val="000000" w:themeColor="text1"/>
     </w:rPr>
     <w:tblPr>
       <w:tblStyleRowBandSize w:val="1"/>
@@ -8675,8 +8098,8 @@
       <w:spacing w:after="0" w:line="240" w:lineRule="auto"/>
     </w:pPr>
     <w:rPr>
-      <w:rFonts w:asciiTheme="majorHAnsi" w:eastAsiaTheme="majorEastAsia" w:hAnsiTheme="majorHAnsi" w:cstheme="majorBidi" w:ascii="Arial" w:hAnsi="Arial" w:eastAsia="Arial"/>
-      <w:sz w:val="24"/>
+      <w:rFonts w:asciiTheme="majorHAnsi" w:eastAsiaTheme="majorEastAsia" w:hAnsiTheme="majorHAnsi" w:cstheme="majorBidi"/>
+      <w:color w:val="000000" w:themeColor="text1"/>
     </w:rPr>
     <w:tblPr>
       <w:tblStyleRowBandSize w:val="1"/>
@@ -8800,8 +8223,8 @@
       <w:spacing w:after="0" w:line="240" w:lineRule="auto"/>
     </w:pPr>
     <w:rPr>
-      <w:rFonts w:asciiTheme="majorHAnsi" w:eastAsiaTheme="majorEastAsia" w:hAnsiTheme="majorHAnsi" w:cstheme="majorBidi" w:ascii="Arial" w:hAnsi="Arial" w:eastAsia="Arial"/>
-      <w:sz w:val="24"/>
+      <w:rFonts w:asciiTheme="majorHAnsi" w:eastAsiaTheme="majorEastAsia" w:hAnsiTheme="majorHAnsi" w:cstheme="majorBidi"/>
+      <w:color w:val="000000" w:themeColor="text1"/>
     </w:rPr>
     <w:tblPr>
       <w:tblStyleRowBandSize w:val="1"/>
@@ -8925,8 +8348,8 @@
       <w:spacing w:after="0" w:line="240" w:lineRule="auto"/>
     </w:pPr>
     <w:rPr>
-      <w:rFonts w:asciiTheme="majorHAnsi" w:eastAsiaTheme="majorEastAsia" w:hAnsiTheme="majorHAnsi" w:cstheme="majorBidi" w:ascii="Arial" w:hAnsi="Arial" w:eastAsia="Arial"/>
-      <w:sz w:val="24"/>
+      <w:rFonts w:asciiTheme="majorHAnsi" w:eastAsiaTheme="majorEastAsia" w:hAnsiTheme="majorHAnsi" w:cstheme="majorBidi"/>
+      <w:color w:val="000000" w:themeColor="text1"/>
     </w:rPr>
     <w:tblPr>
       <w:tblStyleRowBandSize w:val="1"/>
@@ -9049,10 +8472,6 @@
     <w:pPr>
       <w:spacing w:after="0" w:line="240" w:lineRule="auto"/>
     </w:pPr>
-    <w:rPr>
-      <w:rFonts w:ascii="Arial" w:hAnsi="Arial" w:eastAsia="Arial"/>
-      <w:sz w:val="24"/>
-    </w:rPr>
     <w:tblPr>
       <w:tblStyleRowBandSize w:val="1"/>
       <w:tblStyleColBandSize w:val="1"/>
@@ -9194,10 +8613,6 @@
     <w:pPr>
       <w:spacing w:after="0" w:line="240" w:lineRule="auto"/>
     </w:pPr>
-    <w:rPr>
-      <w:rFonts w:ascii="Arial" w:hAnsi="Arial" w:eastAsia="Arial"/>
-      <w:sz w:val="24"/>
-    </w:rPr>
     <w:tblPr>
       <w:tblStyleRowBandSize w:val="1"/>
       <w:tblStyleColBandSize w:val="1"/>
@@ -9339,10 +8754,6 @@
     <w:pPr>
       <w:spacing w:after="0" w:line="240" w:lineRule="auto"/>
     </w:pPr>
-    <w:rPr>
-      <w:rFonts w:ascii="Arial" w:hAnsi="Arial" w:eastAsia="Arial"/>
-      <w:sz w:val="24"/>
-    </w:rPr>
     <w:tblPr>
       <w:tblStyleRowBandSize w:val="1"/>
       <w:tblStyleColBandSize w:val="1"/>
@@ -9484,10 +8895,6 @@
     <w:pPr>
       <w:spacing w:after="0" w:line="240" w:lineRule="auto"/>
     </w:pPr>
-    <w:rPr>
-      <w:rFonts w:ascii="Arial" w:hAnsi="Arial" w:eastAsia="Arial"/>
-      <w:sz w:val="24"/>
-    </w:rPr>
     <w:tblPr>
       <w:tblStyleRowBandSize w:val="1"/>
       <w:tblStyleColBandSize w:val="1"/>
@@ -9629,10 +9036,6 @@
     <w:pPr>
       <w:spacing w:after="0" w:line="240" w:lineRule="auto"/>
     </w:pPr>
-    <w:rPr>
-      <w:rFonts w:ascii="Arial" w:hAnsi="Arial" w:eastAsia="Arial"/>
-      <w:sz w:val="24"/>
-    </w:rPr>
     <w:tblPr>
       <w:tblStyleRowBandSize w:val="1"/>
       <w:tblStyleColBandSize w:val="1"/>
@@ -9774,10 +9177,6 @@
     <w:pPr>
       <w:spacing w:after="0" w:line="240" w:lineRule="auto"/>
     </w:pPr>
-    <w:rPr>
-      <w:rFonts w:ascii="Arial" w:hAnsi="Arial" w:eastAsia="Arial"/>
-      <w:sz w:val="24"/>
-    </w:rPr>
     <w:tblPr>
       <w:tblStyleRowBandSize w:val="1"/>
       <w:tblStyleColBandSize w:val="1"/>
@@ -9919,10 +9318,6 @@
     <w:pPr>
       <w:spacing w:after="0" w:line="240" w:lineRule="auto"/>
     </w:pPr>
-    <w:rPr>
-      <w:rFonts w:ascii="Arial" w:hAnsi="Arial" w:eastAsia="Arial"/>
-      <w:sz w:val="24"/>
-    </w:rPr>
     <w:tblPr>
       <w:tblStyleRowBandSize w:val="1"/>
       <w:tblStyleColBandSize w:val="1"/>
@@ -10065,8 +9460,7 @@
       <w:spacing w:after="0" w:line="240" w:lineRule="auto"/>
     </w:pPr>
     <w:rPr>
-      <w:rFonts w:ascii="Arial" w:hAnsi="Arial" w:eastAsia="Arial"/>
-      <w:sz w:val="24"/>
+      <w:color w:val="FFFFFF" w:themeColor="background1"/>
     </w:rPr>
     <w:tblPr>
       <w:tblStyleRowBandSize w:val="1"/>
@@ -10180,8 +9574,7 @@
       <w:spacing w:after="0" w:line="240" w:lineRule="auto"/>
     </w:pPr>
     <w:rPr>
-      <w:rFonts w:ascii="Arial" w:hAnsi="Arial" w:eastAsia="Arial"/>
-      <w:sz w:val="24"/>
+      <w:color w:val="FFFFFF" w:themeColor="background1"/>
     </w:rPr>
     <w:tblPr>
       <w:tblStyleRowBandSize w:val="1"/>
@@ -10295,8 +9688,7 @@
       <w:spacing w:after="0" w:line="240" w:lineRule="auto"/>
     </w:pPr>
     <w:rPr>
-      <w:rFonts w:ascii="Arial" w:hAnsi="Arial" w:eastAsia="Arial"/>
-      <w:sz w:val="24"/>
+      <w:color w:val="FFFFFF" w:themeColor="background1"/>
     </w:rPr>
     <w:tblPr>
       <w:tblStyleRowBandSize w:val="1"/>
@@ -10410,8 +9802,7 @@
       <w:spacing w:after="0" w:line="240" w:lineRule="auto"/>
     </w:pPr>
     <w:rPr>
-      <w:rFonts w:ascii="Arial" w:hAnsi="Arial" w:eastAsia="Arial"/>
-      <w:sz w:val="24"/>
+      <w:color w:val="FFFFFF" w:themeColor="background1"/>
     </w:rPr>
     <w:tblPr>
       <w:tblStyleRowBandSize w:val="1"/>
@@ -10525,8 +9916,7 @@
       <w:spacing w:after="0" w:line="240" w:lineRule="auto"/>
     </w:pPr>
     <w:rPr>
-      <w:rFonts w:ascii="Arial" w:hAnsi="Arial" w:eastAsia="Arial"/>
-      <w:sz w:val="24"/>
+      <w:color w:val="FFFFFF" w:themeColor="background1"/>
     </w:rPr>
     <w:tblPr>
       <w:tblStyleRowBandSize w:val="1"/>
@@ -10640,8 +10030,7 @@
       <w:spacing w:after="0" w:line="240" w:lineRule="auto"/>
     </w:pPr>
     <w:rPr>
-      <w:rFonts w:ascii="Arial" w:hAnsi="Arial" w:eastAsia="Arial"/>
-      <w:sz w:val="24"/>
+      <w:color w:val="FFFFFF" w:themeColor="background1"/>
     </w:rPr>
     <w:tblPr>
       <w:tblStyleRowBandSize w:val="1"/>
@@ -10755,8 +10144,7 @@
       <w:spacing w:after="0" w:line="240" w:lineRule="auto"/>
     </w:pPr>
     <w:rPr>
-      <w:rFonts w:ascii="Arial" w:hAnsi="Arial" w:eastAsia="Arial"/>
-      <w:sz w:val="24"/>
+      <w:color w:val="FFFFFF" w:themeColor="background1"/>
     </w:rPr>
     <w:tblPr>
       <w:tblStyleRowBandSize w:val="1"/>
@@ -10870,8 +10258,7 @@
       <w:spacing w:after="0" w:line="240" w:lineRule="auto"/>
     </w:pPr>
     <w:rPr>
-      <w:rFonts w:ascii="Arial" w:hAnsi="Arial" w:eastAsia="Arial"/>
-      <w:sz w:val="24"/>
+      <w:color w:val="000000" w:themeColor="text1"/>
     </w:rPr>
     <w:tblPr>
       <w:tblStyleRowBandSize w:val="1"/>
@@ -10993,8 +10380,7 @@
       <w:spacing w:after="0" w:line="240" w:lineRule="auto"/>
     </w:pPr>
     <w:rPr>
-      <w:rFonts w:ascii="Arial" w:hAnsi="Arial" w:eastAsia="Arial"/>
-      <w:sz w:val="24"/>
+      <w:color w:val="000000" w:themeColor="text1"/>
     </w:rPr>
     <w:tblPr>
       <w:tblStyleRowBandSize w:val="1"/>
@@ -11116,8 +10502,7 @@
       <w:spacing w:after="0" w:line="240" w:lineRule="auto"/>
     </w:pPr>
     <w:rPr>
-      <w:rFonts w:ascii="Arial" w:hAnsi="Arial" w:eastAsia="Arial"/>
-      <w:sz w:val="24"/>
+      <w:color w:val="000000" w:themeColor="text1"/>
     </w:rPr>
     <w:tblPr>
       <w:tblStyleRowBandSize w:val="1"/>
@@ -11239,8 +10624,7 @@
       <w:spacing w:after="0" w:line="240" w:lineRule="auto"/>
     </w:pPr>
     <w:rPr>
-      <w:rFonts w:ascii="Arial" w:hAnsi="Arial" w:eastAsia="Arial"/>
-      <w:sz w:val="24"/>
+      <w:color w:val="000000" w:themeColor="text1"/>
     </w:rPr>
     <w:tblPr>
       <w:tblStyleRowBandSize w:val="1"/>
@@ -11352,8 +10736,7 @@
       <w:spacing w:after="0" w:line="240" w:lineRule="auto"/>
     </w:pPr>
     <w:rPr>
-      <w:rFonts w:ascii="Arial" w:hAnsi="Arial" w:eastAsia="Arial"/>
-      <w:sz w:val="24"/>
+      <w:color w:val="000000" w:themeColor="text1"/>
     </w:rPr>
     <w:tblPr>
       <w:tblStyleRowBandSize w:val="1"/>
@@ -11475,8 +10858,7 @@
       <w:spacing w:after="0" w:line="240" w:lineRule="auto"/>
     </w:pPr>
     <w:rPr>
-      <w:rFonts w:ascii="Arial" w:hAnsi="Arial" w:eastAsia="Arial"/>
-      <w:sz w:val="24"/>
+      <w:color w:val="000000" w:themeColor="text1"/>
     </w:rPr>
     <w:tblPr>
       <w:tblStyleRowBandSize w:val="1"/>
@@ -11598,8 +10980,7 @@
       <w:spacing w:after="0" w:line="240" w:lineRule="auto"/>
     </w:pPr>
     <w:rPr>
-      <w:rFonts w:ascii="Arial" w:hAnsi="Arial" w:eastAsia="Arial"/>
-      <w:sz w:val="24"/>
+      <w:color w:val="000000" w:themeColor="text1"/>
     </w:rPr>
     <w:tblPr>
       <w:tblStyleRowBandSize w:val="1"/>
@@ -11721,8 +11102,7 @@
       <w:spacing w:after="0" w:line="240" w:lineRule="auto"/>
     </w:pPr>
     <w:rPr>
-      <w:rFonts w:ascii="Arial" w:hAnsi="Arial" w:eastAsia="Arial"/>
-      <w:sz w:val="24"/>
+      <w:color w:val="000000" w:themeColor="text1"/>
     </w:rPr>
     <w:tblPr>
       <w:tblStyleRowBandSize w:val="1"/>
@@ -11808,8 +11188,7 @@
       <w:spacing w:after="0" w:line="240" w:lineRule="auto"/>
     </w:pPr>
     <w:rPr>
-      <w:rFonts w:ascii="Arial" w:hAnsi="Arial" w:eastAsia="Arial"/>
-      <w:sz w:val="24"/>
+      <w:color w:val="000000" w:themeColor="text1"/>
     </w:rPr>
     <w:tblPr>
       <w:tblStyleRowBandSize w:val="1"/>
@@ -11895,8 +11274,7 @@
       <w:spacing w:after="0" w:line="240" w:lineRule="auto"/>
     </w:pPr>
     <w:rPr>
-      <w:rFonts w:ascii="Arial" w:hAnsi="Arial" w:eastAsia="Arial"/>
-      <w:sz w:val="24"/>
+      <w:color w:val="000000" w:themeColor="text1"/>
     </w:rPr>
     <w:tblPr>
       <w:tblStyleRowBandSize w:val="1"/>
@@ -11982,8 +11360,7 @@
       <w:spacing w:after="0" w:line="240" w:lineRule="auto"/>
     </w:pPr>
     <w:rPr>
-      <w:rFonts w:ascii="Arial" w:hAnsi="Arial" w:eastAsia="Arial"/>
-      <w:sz w:val="24"/>
+      <w:color w:val="000000" w:themeColor="text1"/>
     </w:rPr>
     <w:tblPr>
       <w:tblStyleRowBandSize w:val="1"/>
@@ -12069,8 +11446,7 @@
       <w:spacing w:after="0" w:line="240" w:lineRule="auto"/>
     </w:pPr>
     <w:rPr>
-      <w:rFonts w:ascii="Arial" w:hAnsi="Arial" w:eastAsia="Arial"/>
-      <w:sz w:val="24"/>
+      <w:color w:val="000000" w:themeColor="text1"/>
     </w:rPr>
     <w:tblPr>
       <w:tblStyleRowBandSize w:val="1"/>
@@ -12156,8 +11532,7 @@
       <w:spacing w:after="0" w:line="240" w:lineRule="auto"/>
     </w:pPr>
     <w:rPr>
-      <w:rFonts w:ascii="Arial" w:hAnsi="Arial" w:eastAsia="Arial"/>
-      <w:sz w:val="24"/>
+      <w:color w:val="000000" w:themeColor="text1"/>
     </w:rPr>
     <w:tblPr>
       <w:tblStyleRowBandSize w:val="1"/>
@@ -12243,8 +11618,7 @@
       <w:spacing w:after="0" w:line="240" w:lineRule="auto"/>
     </w:pPr>
     <w:rPr>
-      <w:rFonts w:ascii="Arial" w:hAnsi="Arial" w:eastAsia="Arial"/>
-      <w:sz w:val="24"/>
+      <w:color w:val="000000" w:themeColor="text1"/>
     </w:rPr>
     <w:tblPr>
       <w:tblStyleRowBandSize w:val="1"/>
@@ -12330,8 +11704,7 @@
       <w:spacing w:after="0" w:line="240" w:lineRule="auto"/>
     </w:pPr>
     <w:rPr>
-      <w:rFonts w:ascii="Arial" w:hAnsi="Arial" w:eastAsia="Arial"/>
-      <w:sz w:val="24"/>
+      <w:color w:val="000000" w:themeColor="text1"/>
     </w:rPr>
     <w:tblPr>
       <w:tblStyleRowBandSize w:val="1"/>
@@ -12411,8 +11784,7 @@
       <w:spacing w:after="0" w:line="240" w:lineRule="auto"/>
     </w:pPr>
     <w:rPr>
-      <w:rFonts w:ascii="Arial" w:hAnsi="Arial" w:eastAsia="Arial"/>
-      <w:sz w:val="24"/>
+      <w:color w:val="000000" w:themeColor="text1"/>
     </w:rPr>
     <w:tblPr>
       <w:tblStyleRowBandSize w:val="1"/>
@@ -12492,8 +11864,7 @@
       <w:spacing w:after="0" w:line="240" w:lineRule="auto"/>
     </w:pPr>
     <w:rPr>
-      <w:rFonts w:ascii="Arial" w:hAnsi="Arial" w:eastAsia="Arial"/>
-      <w:sz w:val="24"/>
+      <w:color w:val="000000" w:themeColor="text1"/>
     </w:rPr>
     <w:tblPr>
       <w:tblStyleRowBandSize w:val="1"/>
@@ -12573,8 +11944,7 @@
       <w:spacing w:after="0" w:line="240" w:lineRule="auto"/>
     </w:pPr>
     <w:rPr>
-      <w:rFonts w:ascii="Arial" w:hAnsi="Arial" w:eastAsia="Arial"/>
-      <w:sz w:val="24"/>
+      <w:color w:val="000000" w:themeColor="text1"/>
     </w:rPr>
     <w:tblPr>
       <w:tblStyleRowBandSize w:val="1"/>
@@ -12654,8 +12024,7 @@
       <w:spacing w:after="0" w:line="240" w:lineRule="auto"/>
     </w:pPr>
     <w:rPr>
-      <w:rFonts w:ascii="Arial" w:hAnsi="Arial" w:eastAsia="Arial"/>
-      <w:sz w:val="24"/>
+      <w:color w:val="000000" w:themeColor="text1"/>
     </w:rPr>
     <w:tblPr>
       <w:tblStyleRowBandSize w:val="1"/>
@@ -12735,8 +12104,7 @@
       <w:spacing w:after="0" w:line="240" w:lineRule="auto"/>
     </w:pPr>
     <w:rPr>
-      <w:rFonts w:ascii="Arial" w:hAnsi="Arial" w:eastAsia="Arial"/>
-      <w:sz w:val="24"/>
+      <w:color w:val="000000" w:themeColor="text1"/>
     </w:rPr>
     <w:tblPr>
       <w:tblStyleRowBandSize w:val="1"/>
@@ -12816,8 +12184,7 @@
       <w:spacing w:after="0" w:line="240" w:lineRule="auto"/>
     </w:pPr>
     <w:rPr>
-      <w:rFonts w:ascii="Arial" w:hAnsi="Arial" w:eastAsia="Arial"/>
-      <w:sz w:val="24"/>
+      <w:color w:val="000000" w:themeColor="text1"/>
     </w:rPr>
     <w:tblPr>
       <w:tblStyleRowBandSize w:val="1"/>

</xml_diff>